<commit_message>
modificaicons per error del BOM UTF-8
</commit_message>
<xml_diff>
--- a/documentation/Moreno_Pol_Upload_Web_And_DB_To_Server_DROPLET.docx
+++ b/documentation/Moreno_Pol_Upload_Web_And_DB_To_Server_DROPLET.docx
@@ -2680,7 +2680,7 @@
           <w:b/>
           <w:bCs/>
         </w:rPr>
-        <w:t>–</w:t>
+        <w:t>--</w:t>
       </w:r>
       <w:r>
         <w:rPr>
@@ -2837,6 +2837,17 @@
         <w:br/>
       </w:r>
     </w:p>
+    <w:p>
+      <w:r>
+        <w:t>docker compose down -v</w:t>
+      </w:r>
+    </w:p>
+    <w:p>
+      <w:r>
+        <w:t>docker compose up -d --build</w:t>
+      </w:r>
+    </w:p>
+    <w:p/>
     <w:p>
       <w:r>
         <w:t>Ara ja podríem accedir a la nostra web posant al navegador “</w:t>

</xml_diff>

<commit_message>
antualizacion del docker file
</commit_message>
<xml_diff>
--- a/documentation/Moreno_Pol_Upload_Web_And_DB_To_Server_DROPLET.docx
+++ b/documentation/Moreno_Pol_Upload_Web_And_DB_To_Server_DROPLET.docx
@@ -2833,21 +2833,17 @@
           </wp:inline>
         </w:drawing>
       </w:r>
-      <w:r>
-        <w:br/>
-      </w:r>
     </w:p>
     <w:p>
       <w:r>
-        <w:t>docker compose down -v</w:t>
+        <w:t>docker exec -it db-mysql bash</w:t>
       </w:r>
     </w:p>
     <w:p>
       <w:r>
-        <w:t>docker compose up -d --build</w:t>
+        <w:t>mysql -u root -p</w:t>
       </w:r>
     </w:p>
-    <w:p/>
     <w:p>
       <w:r>
         <w:t>Ara ja podríem accedir a la nostra web posant al navegador “</w:t>

</xml_diff>

<commit_message>
arreglo para apuntar a la API bien
</commit_message>
<xml_diff>
--- a/documentation/Moreno_Pol_Upload_Web_And_DB_To_Server_DROPLET.docx
+++ b/documentation/Moreno_Pol_Upload_Web_And_DB_To_Server_DROPLET.docx
@@ -94,6 +94,7 @@
         </w:rPr>
         <w:t xml:space="preserve">  “</w:t>
       </w:r>
+      <w:proofErr w:type="spellStart"/>
       <w:r>
         <w:rPr>
           <w:rFonts w:ascii="Sting Black" w:hAnsi="Sting Black"/>
@@ -101,8 +102,9 @@
           <w:sz w:val="96"/>
           <w:szCs w:val="96"/>
         </w:rPr>
-        <w:t xml:space="preserve">Bees </w:t>
-      </w:r>
+        <w:t>Bees</w:t>
+      </w:r>
+      <w:proofErr w:type="spellEnd"/>
       <w:r>
         <w:rPr>
           <w:rFonts w:ascii="Sting Black" w:hAnsi="Sting Black"/>
@@ -110,9 +112,9 @@
           <w:sz w:val="96"/>
           <w:szCs w:val="96"/>
         </w:rPr>
-        <w:t>Cavern</w:t>
-      </w:r>
-      <w:bookmarkEnd w:id="0"/>
+        <w:t xml:space="preserve"> </w:t>
+      </w:r>
+      <w:proofErr w:type="spellStart"/>
       <w:r>
         <w:rPr>
           <w:rFonts w:ascii="Sting Black" w:hAnsi="Sting Black"/>
@@ -120,53 +122,80 @@
           <w:sz w:val="96"/>
           <w:szCs w:val="96"/>
         </w:rPr>
-        <w:t>”</w:t>
-      </w:r>
-    </w:p>
-    <w:p>
-      <w:pPr>
-        <w:jc w:val="center"/>
-        <w:rPr>
-          <w:sz w:val="32"/>
-          <w:szCs w:val="32"/>
-        </w:rPr>
-      </w:pPr>
-    </w:p>
-    <w:p>
-      <w:pPr>
-        <w:jc w:val="center"/>
-        <w:rPr>
-          <w:sz w:val="32"/>
-          <w:szCs w:val="32"/>
-        </w:rPr>
-      </w:pPr>
-    </w:p>
-    <w:p>
-      <w:pPr>
-        <w:jc w:val="center"/>
-        <w:rPr>
-          <w:sz w:val="32"/>
-          <w:szCs w:val="32"/>
-          <w:u w:val="single"/>
-        </w:rPr>
-      </w:pPr>
-      <w:r>
-        <w:rPr>
-          <w:sz w:val="32"/>
-          <w:szCs w:val="32"/>
-        </w:rPr>
-        <w:t>Pujar la Web&amp;DB a un Servidor</w:t>
-      </w:r>
-    </w:p>
-    <w:p>
-      <w:pPr>
-        <w:jc w:val="center"/>
+        <w:t>Cavern</w:t>
+      </w:r>
+      <w:bookmarkEnd w:id="0"/>
+      <w:proofErr w:type="spellEnd"/>
+      <w:r>
         <w:rPr>
           <w:rFonts w:ascii="Sting Black" w:hAnsi="Sting Black"/>
           <w:color w:val="C10000"/>
           <w:sz w:val="96"/>
           <w:szCs w:val="96"/>
         </w:rPr>
+        <w:t>”</w:t>
+      </w:r>
+    </w:p>
+    <w:p>
+      <w:pPr>
+        <w:jc w:val="center"/>
+        <w:rPr>
+          <w:sz w:val="32"/>
+          <w:szCs w:val="32"/>
+        </w:rPr>
+      </w:pPr>
+    </w:p>
+    <w:p>
+      <w:pPr>
+        <w:jc w:val="center"/>
+        <w:rPr>
+          <w:sz w:val="32"/>
+          <w:szCs w:val="32"/>
+        </w:rPr>
+      </w:pPr>
+    </w:p>
+    <w:p>
+      <w:pPr>
+        <w:jc w:val="center"/>
+        <w:rPr>
+          <w:sz w:val="32"/>
+          <w:szCs w:val="32"/>
+          <w:u w:val="single"/>
+        </w:rPr>
+      </w:pPr>
+      <w:r>
+        <w:rPr>
+          <w:sz w:val="32"/>
+          <w:szCs w:val="32"/>
+        </w:rPr>
+        <w:t xml:space="preserve">Pujar la </w:t>
+      </w:r>
+      <w:proofErr w:type="spellStart"/>
+      <w:r>
+        <w:rPr>
+          <w:sz w:val="32"/>
+          <w:szCs w:val="32"/>
+        </w:rPr>
+        <w:t>Web&amp;DB</w:t>
+      </w:r>
+      <w:proofErr w:type="spellEnd"/>
+      <w:r>
+        <w:rPr>
+          <w:sz w:val="32"/>
+          <w:szCs w:val="32"/>
+        </w:rPr>
+        <w:t xml:space="preserve"> a un Servidor</w:t>
+      </w:r>
+    </w:p>
+    <w:p>
+      <w:pPr>
+        <w:jc w:val="center"/>
+        <w:rPr>
+          <w:rFonts w:ascii="Sting Black" w:hAnsi="Sting Black"/>
+          <w:color w:val="C10000"/>
+          <w:sz w:val="96"/>
+          <w:szCs w:val="96"/>
+        </w:rPr>
       </w:pPr>
     </w:p>
     <w:p>
@@ -213,10 +242,34 @@
     </w:p>
     <w:p>
       <w:r>
-        <w:t xml:space="preserve">He escollit fer-ho amb un servidor virtual de DigitalOcean que s’anomenen Droplets, aquí crearíem com una VM </w:t>
-      </w:r>
-      <w:r>
-        <w:t xml:space="preserve">en remot (anomenades DROPLETs) </w:t>
+        <w:t xml:space="preserve">He escollit fer-ho amb un servidor virtual de </w:t>
+      </w:r>
+      <w:proofErr w:type="spellStart"/>
+      <w:r>
+        <w:t>DigitalOcean</w:t>
+      </w:r>
+      <w:proofErr w:type="spellEnd"/>
+      <w:r>
+        <w:t xml:space="preserve"> que s’anomenen </w:t>
+      </w:r>
+      <w:proofErr w:type="spellStart"/>
+      <w:r>
+        <w:t>Droplets</w:t>
+      </w:r>
+      <w:proofErr w:type="spellEnd"/>
+      <w:r>
+        <w:t xml:space="preserve">, aquí crearíem com una VM </w:t>
+      </w:r>
+      <w:r>
+        <w:t xml:space="preserve">en remot (anomenades </w:t>
+      </w:r>
+      <w:proofErr w:type="spellStart"/>
+      <w:r>
+        <w:t>DROPLETs</w:t>
+      </w:r>
+      <w:proofErr w:type="spellEnd"/>
+      <w:r>
+        <w:t xml:space="preserve">) </w:t>
       </w:r>
       <w:r>
         <w:t>on podrem aixecar els contenidors amb els serveis que siguin necessaris per servir el contingut de la web com a un servidor Web</w:t>
@@ -237,13 +290,39 @@
           <w:numId w:val="10"/>
         </w:numPr>
       </w:pPr>
-      <w:r>
-        <w:t>Solicitar el Servei de DigitalOcean</w:t>
-      </w:r>
+      <w:proofErr w:type="spellStart"/>
+      <w:r>
+        <w:t>Solicitar</w:t>
+      </w:r>
+      <w:proofErr w:type="spellEnd"/>
+      <w:r>
+        <w:t xml:space="preserve"> el Servei de </w:t>
+      </w:r>
+      <w:proofErr w:type="spellStart"/>
+      <w:r>
+        <w:t>DigitalOcean</w:t>
+      </w:r>
+      <w:proofErr w:type="spellEnd"/>
     </w:p>
     <w:p>
       <w:r>
-        <w:t>Aprofitarem el servei gratuït de GitHub per a estudiants i sol·licitarem el servei de DigitalOcean per fer servir l’eina de Droplet:</w:t>
+        <w:t xml:space="preserve">Aprofitarem el servei gratuït de GitHub per a estudiants i sol·licitarem el servei de </w:t>
+      </w:r>
+      <w:proofErr w:type="spellStart"/>
+      <w:r>
+        <w:t>DigitalOcean</w:t>
+      </w:r>
+      <w:proofErr w:type="spellEnd"/>
+      <w:r>
+        <w:t xml:space="preserve"> per fer servir l’eina de </w:t>
+      </w:r>
+      <w:proofErr w:type="spellStart"/>
+      <w:r>
+        <w:t>Droplet</w:t>
+      </w:r>
+      <w:proofErr w:type="spellEnd"/>
+      <w:r>
+        <w:t>:</w:t>
       </w:r>
     </w:p>
     <w:p>
@@ -260,8 +339,29 @@
       </w:hyperlink>
     </w:p>
     <w:p>
-      <w:r>
-        <w:t xml:space="preserve">Clickem ma veure mes de la secció de WebDev i allà baixem fins trobar l’oferta de DigitalOcean: </w:t>
+      <w:proofErr w:type="spellStart"/>
+      <w:r>
+        <w:t>Clickem</w:t>
+      </w:r>
+      <w:proofErr w:type="spellEnd"/>
+      <w:r>
+        <w:t xml:space="preserve"> ma veure mes de la secció de </w:t>
+      </w:r>
+      <w:proofErr w:type="spellStart"/>
+      <w:r>
+        <w:t>WebDev</w:t>
+      </w:r>
+      <w:proofErr w:type="spellEnd"/>
+      <w:r>
+        <w:t xml:space="preserve"> i allà baixem fins trobar l’oferta de </w:t>
+      </w:r>
+      <w:proofErr w:type="spellStart"/>
+      <w:r>
+        <w:t>DigitalOcean</w:t>
+      </w:r>
+      <w:proofErr w:type="spellEnd"/>
+      <w:r>
+        <w:t xml:space="preserve">: </w:t>
       </w:r>
     </w:p>
     <w:p>
@@ -647,7 +747,23 @@
     </w:p>
     <w:p>
       <w:r>
-        <w:t xml:space="preserve">Verifiquem la vinculació amb la cointa de github: </w:t>
+        <w:t xml:space="preserve">Verifiquem la vinculació amb la </w:t>
+      </w:r>
+      <w:proofErr w:type="spellStart"/>
+      <w:r>
+        <w:t>cointa</w:t>
+      </w:r>
+      <w:proofErr w:type="spellEnd"/>
+      <w:r>
+        <w:t xml:space="preserve"> de </w:t>
+      </w:r>
+      <w:proofErr w:type="spellStart"/>
+      <w:r>
+        <w:t>github</w:t>
+      </w:r>
+      <w:proofErr w:type="spellEnd"/>
+      <w:r>
+        <w:t xml:space="preserve">: </w:t>
       </w:r>
       <w:r>
         <w:rPr>
@@ -829,7 +945,23 @@
     </w:p>
     <w:p>
       <w:r>
-        <w:t>Un cop fet això ja disposem del crèdit per poder fer us de serveis de DigitalOcean per valor de 200 dollars, mes que suficient pel que desitjem implementar.</w:t>
+        <w:t xml:space="preserve">Un cop fet això ja disposem del crèdit per poder fer us de serveis de </w:t>
+      </w:r>
+      <w:proofErr w:type="spellStart"/>
+      <w:r>
+        <w:t>DigitalOcean</w:t>
+      </w:r>
+      <w:proofErr w:type="spellEnd"/>
+      <w:r>
+        <w:t xml:space="preserve"> per valor de 200 dollars, mes que suficient pel que </w:t>
+      </w:r>
+      <w:proofErr w:type="spellStart"/>
+      <w:r>
+        <w:t>desitjem</w:t>
+      </w:r>
+      <w:proofErr w:type="spellEnd"/>
+      <w:r>
+        <w:t xml:space="preserve"> implementar.</w:t>
       </w:r>
     </w:p>
     <w:p>
@@ -846,7 +978,23 @@
     </w:p>
     <w:p>
       <w:r>
-        <w:t>A la finestra de “Droplets” clicarem a “Crear Droplet”</w:t>
+        <w:t>A la finestra de “</w:t>
+      </w:r>
+      <w:proofErr w:type="spellStart"/>
+      <w:r>
+        <w:t>Droplets</w:t>
+      </w:r>
+      <w:proofErr w:type="spellEnd"/>
+      <w:r>
+        <w:t xml:space="preserve">” clicarem a “Crear </w:t>
+      </w:r>
+      <w:proofErr w:type="spellStart"/>
+      <w:r>
+        <w:t>Droplet</w:t>
+      </w:r>
+      <w:proofErr w:type="spellEnd"/>
+      <w:r>
+        <w:t>”</w:t>
       </w:r>
       <w:r>
         <w:t>:</w:t>
@@ -1104,7 +1252,23 @@
     </w:p>
     <w:p>
       <w:r>
-        <w:t>I com a nom del droplet i del host afegirem el següent “bc-droplet”</w:t>
+        <w:t xml:space="preserve">I com a nom del </w:t>
+      </w:r>
+      <w:proofErr w:type="spellStart"/>
+      <w:r>
+        <w:t>droplet</w:t>
+      </w:r>
+      <w:proofErr w:type="spellEnd"/>
+      <w:r>
+        <w:t xml:space="preserve"> i del host afegirem el següent “</w:t>
+      </w:r>
+      <w:proofErr w:type="spellStart"/>
+      <w:r>
+        <w:t>bc-droplet</w:t>
+      </w:r>
+      <w:proofErr w:type="spellEnd"/>
+      <w:r>
+        <w:t>”</w:t>
       </w:r>
       <w:r>
         <w:t xml:space="preserve"> afegint algun tal mes descriptiu</w:t>
@@ -1157,7 +1321,23 @@
     </w:p>
     <w:p>
       <w:r>
-        <w:t>Per ultim dins del projecte ja podem comprovar que el droplet esta creat correctament:</w:t>
+        <w:t xml:space="preserve">Per </w:t>
+      </w:r>
+      <w:proofErr w:type="spellStart"/>
+      <w:r>
+        <w:t>ultim</w:t>
+      </w:r>
+      <w:proofErr w:type="spellEnd"/>
+      <w:r>
+        <w:t xml:space="preserve"> dins del projecte ja podem comprovar que el </w:t>
+      </w:r>
+      <w:proofErr w:type="spellStart"/>
+      <w:r>
+        <w:t>droplet</w:t>
+      </w:r>
+      <w:proofErr w:type="spellEnd"/>
+      <w:r>
+        <w:t xml:space="preserve"> esta creat correctament:</w:t>
       </w:r>
     </w:p>
     <w:p>
@@ -1207,15 +1387,22 @@
       <w:pPr>
         <w:pStyle w:val="Ttulo2"/>
       </w:pPr>
-      <w:r>
-        <w:t xml:space="preserve">Connexio al </w:t>
-      </w:r>
+      <w:proofErr w:type="spellStart"/>
+      <w:r>
+        <w:t>Connexio</w:t>
+      </w:r>
+      <w:proofErr w:type="spellEnd"/>
+      <w:r>
+        <w:t xml:space="preserve"> al </w:t>
+      </w:r>
+      <w:proofErr w:type="spellStart"/>
       <w:r>
         <w:t>D</w:t>
       </w:r>
       <w:r>
         <w:t>roplet</w:t>
       </w:r>
+      <w:proofErr w:type="spellEnd"/>
     </w:p>
     <w:p>
       <w:r>
@@ -1225,7 +1412,15 @@
         <w:t>connectar-nos</w:t>
       </w:r>
       <w:r>
-        <w:t xml:space="preserve"> al droplet ho farem via </w:t>
+        <w:t xml:space="preserve"> al </w:t>
+      </w:r>
+      <w:proofErr w:type="spellStart"/>
+      <w:r>
+        <w:t>droplet</w:t>
+      </w:r>
+      <w:proofErr w:type="spellEnd"/>
+      <w:r>
+        <w:t xml:space="preserve"> ho farem via </w:t>
       </w:r>
       <w:r>
         <w:t>SSH</w:t>
@@ -1281,7 +1476,23 @@
           <w:b/>
           <w:bCs/>
         </w:rPr>
-        <w:t>&gt; ssh root@</w:t>
+        <w:t xml:space="preserve">&gt; </w:t>
+      </w:r>
+      <w:proofErr w:type="spellStart"/>
+      <w:r>
+        <w:rPr>
+          <w:b/>
+          <w:bCs/>
+        </w:rPr>
+        <w:t>ssh</w:t>
+      </w:r>
+      <w:proofErr w:type="spellEnd"/>
+      <w:r>
+        <w:rPr>
+          <w:b/>
+          <w:bCs/>
+        </w:rPr>
+        <w:t xml:space="preserve"> root@</w:t>
       </w:r>
       <w:r>
         <w:rPr>
@@ -1343,7 +1554,15 @@
     </w:p>
     <w:p>
       <w:r>
-        <w:t>Ja hem accedit al droplet en remot, anem a comprovar que te configurat el DNS de Google i a preparar-lo:</w:t>
+        <w:t xml:space="preserve">Ja hem accedit al </w:t>
+      </w:r>
+      <w:proofErr w:type="spellStart"/>
+      <w:r>
+        <w:t>droplet</w:t>
+      </w:r>
+      <w:proofErr w:type="spellEnd"/>
+      <w:r>
+        <w:t xml:space="preserve"> en remot, anem a comprovar que te configurat el DNS de Google i a preparar-lo:</w:t>
       </w:r>
     </w:p>
     <w:p>
@@ -1398,12 +1617,33 @@
         <w:t>Preparació</w:t>
       </w:r>
       <w:r>
-        <w:t xml:space="preserve"> de les eines necessàries al Droplet</w:t>
-      </w:r>
+        <w:t xml:space="preserve"> de les eines necessàries al </w:t>
+      </w:r>
+      <w:proofErr w:type="spellStart"/>
+      <w:r>
+        <w:t>Droplet</w:t>
+      </w:r>
+      <w:proofErr w:type="spellEnd"/>
     </w:p>
     <w:p>
       <w:r>
-        <w:t>Primer de res farem un update i upgrade del SO:</w:t>
+        <w:t xml:space="preserve">Primer de res farem un </w:t>
+      </w:r>
+      <w:proofErr w:type="spellStart"/>
+      <w:r>
+        <w:t>update</w:t>
+      </w:r>
+      <w:proofErr w:type="spellEnd"/>
+      <w:r>
+        <w:t xml:space="preserve"> i </w:t>
+      </w:r>
+      <w:proofErr w:type="spellStart"/>
+      <w:r>
+        <w:t>upgrade</w:t>
+      </w:r>
+      <w:proofErr w:type="spellEnd"/>
+      <w:r>
+        <w:t xml:space="preserve"> del SO:</w:t>
       </w:r>
     </w:p>
     <w:p>
@@ -1418,7 +1658,71 @@
           <w:b/>
           <w:bCs/>
         </w:rPr>
-        <w:t>&gt; apt update &amp;&amp; apt upgrade -y</w:t>
+        <w:t xml:space="preserve">&gt; </w:t>
+      </w:r>
+      <w:proofErr w:type="spellStart"/>
+      <w:r>
+        <w:rPr>
+          <w:b/>
+          <w:bCs/>
+        </w:rPr>
+        <w:t>apt</w:t>
+      </w:r>
+      <w:proofErr w:type="spellEnd"/>
+      <w:r>
+        <w:rPr>
+          <w:b/>
+          <w:bCs/>
+        </w:rPr>
+        <w:t xml:space="preserve"> </w:t>
+      </w:r>
+      <w:proofErr w:type="spellStart"/>
+      <w:r>
+        <w:rPr>
+          <w:b/>
+          <w:bCs/>
+        </w:rPr>
+        <w:t>update</w:t>
+      </w:r>
+      <w:proofErr w:type="spellEnd"/>
+      <w:r>
+        <w:rPr>
+          <w:b/>
+          <w:bCs/>
+        </w:rPr>
+        <w:t xml:space="preserve"> &amp;&amp; </w:t>
+      </w:r>
+      <w:proofErr w:type="spellStart"/>
+      <w:r>
+        <w:rPr>
+          <w:b/>
+          <w:bCs/>
+        </w:rPr>
+        <w:t>apt</w:t>
+      </w:r>
+      <w:proofErr w:type="spellEnd"/>
+      <w:r>
+        <w:rPr>
+          <w:b/>
+          <w:bCs/>
+        </w:rPr>
+        <w:t xml:space="preserve"> </w:t>
+      </w:r>
+      <w:proofErr w:type="spellStart"/>
+      <w:r>
+        <w:rPr>
+          <w:b/>
+          <w:bCs/>
+        </w:rPr>
+        <w:t>upgrade</w:t>
+      </w:r>
+      <w:proofErr w:type="spellEnd"/>
+      <w:r>
+        <w:rPr>
+          <w:b/>
+          <w:bCs/>
+        </w:rPr>
+        <w:t xml:space="preserve"> -y</w:t>
       </w:r>
     </w:p>
     <w:p>
@@ -1509,6 +1813,7 @@
       <w:r>
         <w:t>Seguit farem la descarrega  e instal·lació de les eines que necessitarem com “</w:t>
       </w:r>
+      <w:proofErr w:type="spellStart"/>
       <w:r>
         <w:rPr>
           <w:b/>
@@ -1516,6 +1821,7 @@
         </w:rPr>
         <w:t>docker</w:t>
       </w:r>
+      <w:proofErr w:type="spellEnd"/>
       <w:r>
         <w:t>” i “</w:t>
       </w:r>
@@ -1542,7 +1848,39 @@
           <w:b/>
           <w:bCs/>
         </w:rPr>
-        <w:t>&gt; apt install -y docker.io docker-compose-v2 git</w:t>
+        <w:t xml:space="preserve">&gt; </w:t>
+      </w:r>
+      <w:proofErr w:type="spellStart"/>
+      <w:r>
+        <w:rPr>
+          <w:b/>
+          <w:bCs/>
+        </w:rPr>
+        <w:t>apt</w:t>
+      </w:r>
+      <w:proofErr w:type="spellEnd"/>
+      <w:r>
+        <w:rPr>
+          <w:b/>
+          <w:bCs/>
+        </w:rPr>
+        <w:t xml:space="preserve"> </w:t>
+      </w:r>
+      <w:proofErr w:type="spellStart"/>
+      <w:r>
+        <w:rPr>
+          <w:b/>
+          <w:bCs/>
+        </w:rPr>
+        <w:t>install</w:t>
+      </w:r>
+      <w:proofErr w:type="spellEnd"/>
+      <w:r>
+        <w:rPr>
+          <w:b/>
+          <w:bCs/>
+        </w:rPr>
+        <w:t xml:space="preserve"> -y docker.io docker-compose-v2 git</w:t>
       </w:r>
     </w:p>
     <w:p>
@@ -1658,12 +1996,49 @@
         <w:t xml:space="preserve">Configuració </w:t>
       </w:r>
       <w:r>
-        <w:t>del Droplet</w:t>
-      </w:r>
+        <w:t xml:space="preserve">del </w:t>
+      </w:r>
+      <w:proofErr w:type="spellStart"/>
+      <w:r>
+        <w:t>Droplet</w:t>
+      </w:r>
+      <w:proofErr w:type="spellEnd"/>
     </w:p>
     <w:p>
       <w:r>
-        <w:t>Ara ja podríem procedir amb la creació del directori local on voldríem clonar el repository de GIT dins del Droplet, així que procedirem amb això (el directori estarà en “var/www/primerprojectemoreno/”):</w:t>
+        <w:t xml:space="preserve">Ara ja podríem procedir amb la creació del directori local on voldríem clonar el </w:t>
+      </w:r>
+      <w:proofErr w:type="spellStart"/>
+      <w:r>
+        <w:t>repository</w:t>
+      </w:r>
+      <w:proofErr w:type="spellEnd"/>
+      <w:r>
+        <w:t xml:space="preserve"> de GIT dins del </w:t>
+      </w:r>
+      <w:proofErr w:type="spellStart"/>
+      <w:r>
+        <w:t>Droplet</w:t>
+      </w:r>
+      <w:proofErr w:type="spellEnd"/>
+      <w:r>
+        <w:t>, així que procedirem amb això (el directori estarà en “var/</w:t>
+      </w:r>
+      <w:proofErr w:type="spellStart"/>
+      <w:r>
+        <w:t>www</w:t>
+      </w:r>
+      <w:proofErr w:type="spellEnd"/>
+      <w:r>
+        <w:t>/</w:t>
+      </w:r>
+      <w:proofErr w:type="spellStart"/>
+      <w:r>
+        <w:t>primerprojectemoreno</w:t>
+      </w:r>
+      <w:proofErr w:type="spellEnd"/>
+      <w:r>
+        <w:t>/”):</w:t>
       </w:r>
     </w:p>
     <w:p>
@@ -1678,8 +2053,49 @@
           <w:b/>
           <w:bCs/>
         </w:rPr>
-        <w:t>&gt; mkdir -p /var/www/primerprojectemoreno</w:t>
-      </w:r>
+        <w:t xml:space="preserve">&gt; </w:t>
+      </w:r>
+      <w:proofErr w:type="spellStart"/>
+      <w:r>
+        <w:rPr>
+          <w:b/>
+          <w:bCs/>
+        </w:rPr>
+        <w:t>mkdir</w:t>
+      </w:r>
+      <w:proofErr w:type="spellEnd"/>
+      <w:r>
+        <w:rPr>
+          <w:b/>
+          <w:bCs/>
+        </w:rPr>
+        <w:t xml:space="preserve"> -p /var/</w:t>
+      </w:r>
+      <w:proofErr w:type="spellStart"/>
+      <w:r>
+        <w:rPr>
+          <w:b/>
+          <w:bCs/>
+        </w:rPr>
+        <w:t>www</w:t>
+      </w:r>
+      <w:proofErr w:type="spellEnd"/>
+      <w:r>
+        <w:rPr>
+          <w:b/>
+          <w:bCs/>
+        </w:rPr>
+        <w:t>/</w:t>
+      </w:r>
+      <w:proofErr w:type="spellStart"/>
+      <w:r>
+        <w:rPr>
+          <w:b/>
+          <w:bCs/>
+        </w:rPr>
+        <w:t>primerprojectemoreno</w:t>
+      </w:r>
+      <w:proofErr w:type="spellEnd"/>
     </w:p>
     <w:p>
       <w:pPr>
@@ -1747,7 +2163,39 @@
           <w:b/>
           <w:bCs/>
         </w:rPr>
-        <w:t xml:space="preserve">&gt; git config --global user.name “BeesCavern </w:t>
+        <w:t xml:space="preserve">&gt; git </w:t>
+      </w:r>
+      <w:proofErr w:type="spellStart"/>
+      <w:r>
+        <w:rPr>
+          <w:b/>
+          <w:bCs/>
+        </w:rPr>
+        <w:t>config</w:t>
+      </w:r>
+      <w:proofErr w:type="spellEnd"/>
+      <w:r>
+        <w:rPr>
+          <w:b/>
+          <w:bCs/>
+        </w:rPr>
+        <w:t xml:space="preserve"> --global user.name “</w:t>
+      </w:r>
+      <w:proofErr w:type="spellStart"/>
+      <w:r>
+        <w:rPr>
+          <w:b/>
+          <w:bCs/>
+        </w:rPr>
+        <w:t>BeesCavern</w:t>
+      </w:r>
+      <w:proofErr w:type="spellEnd"/>
+      <w:r>
+        <w:rPr>
+          <w:b/>
+          <w:bCs/>
+        </w:rPr>
+        <w:t xml:space="preserve"> </w:t>
       </w:r>
       <w:r>
         <w:rPr>
@@ -1756,12 +2204,21 @@
         </w:rPr>
         <w:t xml:space="preserve">Pol </w:t>
       </w:r>
-      <w:r>
-        <w:rPr>
-          <w:b/>
-          <w:bCs/>
-        </w:rPr>
-        <w:t>Droplet”</w:t>
+      <w:proofErr w:type="spellStart"/>
+      <w:r>
+        <w:rPr>
+          <w:b/>
+          <w:bCs/>
+        </w:rPr>
+        <w:t>Droplet</w:t>
+      </w:r>
+      <w:proofErr w:type="spellEnd"/>
+      <w:r>
+        <w:rPr>
+          <w:b/>
+          <w:bCs/>
+        </w:rPr>
+        <w:t>”</w:t>
       </w:r>
     </w:p>
     <w:p>
@@ -1776,7 +2233,39 @@
           <w:b/>
           <w:bCs/>
         </w:rPr>
-        <w:t>&gt; git config --global user.email “polmorenofp23@ibf.cat”</w:t>
+        <w:t xml:space="preserve">&gt; git </w:t>
+      </w:r>
+      <w:proofErr w:type="spellStart"/>
+      <w:r>
+        <w:rPr>
+          <w:b/>
+          <w:bCs/>
+        </w:rPr>
+        <w:t>config</w:t>
+      </w:r>
+      <w:proofErr w:type="spellEnd"/>
+      <w:r>
+        <w:rPr>
+          <w:b/>
+          <w:bCs/>
+        </w:rPr>
+        <w:t xml:space="preserve"> --global </w:t>
+      </w:r>
+      <w:proofErr w:type="spellStart"/>
+      <w:r>
+        <w:rPr>
+          <w:b/>
+          <w:bCs/>
+        </w:rPr>
+        <w:t>user.email</w:t>
+      </w:r>
+      <w:proofErr w:type="spellEnd"/>
+      <w:r>
+        <w:rPr>
+          <w:b/>
+          <w:bCs/>
+        </w:rPr>
+        <w:t xml:space="preserve"> “polmorenofp23@ibf.cat”</w:t>
       </w:r>
     </w:p>
     <w:p>
@@ -1820,7 +2309,15 @@
     </w:p>
     <w:p>
       <w:r>
-        <w:t>Ara ens caldrà generar dins del Droplet les claus de SSH amb les comandes</w:t>
+        <w:t xml:space="preserve">Ara ens caldrà generar dins del </w:t>
+      </w:r>
+      <w:proofErr w:type="spellStart"/>
+      <w:r>
+        <w:t>Droplet</w:t>
+      </w:r>
+      <w:proofErr w:type="spellEnd"/>
+      <w:r>
+        <w:t xml:space="preserve"> les claus de SSH amb les comandes</w:t>
       </w:r>
       <w:r>
         <w:t xml:space="preserve"> (ed25519)</w:t>
@@ -1835,7 +2332,23 @@
           <w:b/>
           <w:bCs/>
         </w:rPr>
-        <w:t xml:space="preserve">&gt; ssh-keygen -t </w:t>
+        <w:t xml:space="preserve">&gt; </w:t>
+      </w:r>
+      <w:proofErr w:type="spellStart"/>
+      <w:r>
+        <w:rPr>
+          <w:b/>
+          <w:bCs/>
+        </w:rPr>
+        <w:t>ssh-keygen</w:t>
+      </w:r>
+      <w:proofErr w:type="spellEnd"/>
+      <w:r>
+        <w:rPr>
+          <w:b/>
+          <w:bCs/>
+        </w:rPr>
+        <w:t xml:space="preserve"> -t </w:t>
       </w:r>
       <w:r>
         <w:rPr>
@@ -1912,7 +2425,23 @@
           <w:b/>
           <w:bCs/>
         </w:rPr>
-        <w:t>cat ~/.ssh/id_</w:t>
+        <w:t>cat ~/.</w:t>
+      </w:r>
+      <w:proofErr w:type="spellStart"/>
+      <w:r>
+        <w:rPr>
+          <w:b/>
+          <w:bCs/>
+        </w:rPr>
+        <w:t>ssh</w:t>
+      </w:r>
+      <w:proofErr w:type="spellEnd"/>
+      <w:r>
+        <w:rPr>
+          <w:b/>
+          <w:bCs/>
+        </w:rPr>
+        <w:t>/id_</w:t>
       </w:r>
       <w:r>
         <w:rPr>
@@ -2017,7 +2546,39 @@
           <w:b/>
           <w:bCs/>
         </w:rPr>
-        <w:t>“Settings” -&gt; “SSH and GPG Keys”</w:t>
+        <w:t xml:space="preserve">“Settings” -&gt; “SSH </w:t>
+      </w:r>
+      <w:proofErr w:type="spellStart"/>
+      <w:r>
+        <w:rPr>
+          <w:b/>
+          <w:bCs/>
+        </w:rPr>
+        <w:t>and</w:t>
+      </w:r>
+      <w:proofErr w:type="spellEnd"/>
+      <w:r>
+        <w:rPr>
+          <w:b/>
+          <w:bCs/>
+        </w:rPr>
+        <w:t xml:space="preserve"> GPG </w:t>
+      </w:r>
+      <w:proofErr w:type="spellStart"/>
+      <w:r>
+        <w:rPr>
+          <w:b/>
+          <w:bCs/>
+        </w:rPr>
+        <w:t>Keys</w:t>
+      </w:r>
+      <w:proofErr w:type="spellEnd"/>
+      <w:r>
+        <w:rPr>
+          <w:b/>
+          <w:bCs/>
+        </w:rPr>
+        <w:t>”</w:t>
       </w:r>
       <w:r>
         <w:t xml:space="preserve"> i li donarem al boto de </w:t>
@@ -2027,10 +2588,34 @@
           <w:b/>
           <w:bCs/>
         </w:rPr>
-        <w:t>“New SSHKey”</w:t>
-      </w:r>
-      <w:r>
-        <w:t xml:space="preserve"> per donar-li autorització d’accés a la conta de git des de el Droplet, indicant així que aquest te permís per accedir a la conta de GitHub</w:t>
+        <w:t xml:space="preserve">“New </w:t>
+      </w:r>
+      <w:proofErr w:type="spellStart"/>
+      <w:r>
+        <w:rPr>
+          <w:b/>
+          <w:bCs/>
+        </w:rPr>
+        <w:t>SSHKey</w:t>
+      </w:r>
+      <w:proofErr w:type="spellEnd"/>
+      <w:r>
+        <w:rPr>
+          <w:b/>
+          <w:bCs/>
+        </w:rPr>
+        <w:t>”</w:t>
+      </w:r>
+      <w:r>
+        <w:t xml:space="preserve"> per donar-li autorització d’accés a la conta de git des de el </w:t>
+      </w:r>
+      <w:proofErr w:type="spellStart"/>
+      <w:r>
+        <w:t>Droplet</w:t>
+      </w:r>
+      <w:proofErr w:type="spellEnd"/>
+      <w:r>
+        <w:t>, indicant així que aquest te permís per accedir a la conta de GitHub</w:t>
       </w:r>
       <w:r>
         <w:t xml:space="preserve"> (</w:t>
@@ -2092,7 +2677,31 @@
     <w:p/>
     <w:p>
       <w:r>
-        <w:t>Creem la clau afegintli un nom com el que l’identifiqui com a “BeesCavern Droplet” i aquí enganxem la clau SSH:</w:t>
+        <w:t xml:space="preserve">Creem la clau </w:t>
+      </w:r>
+      <w:proofErr w:type="spellStart"/>
+      <w:r>
+        <w:t>afegintli</w:t>
+      </w:r>
+      <w:proofErr w:type="spellEnd"/>
+      <w:r>
+        <w:t xml:space="preserve"> un nom com el que l’identifiqui com a “</w:t>
+      </w:r>
+      <w:proofErr w:type="spellStart"/>
+      <w:r>
+        <w:t>BeesCavern</w:t>
+      </w:r>
+      <w:proofErr w:type="spellEnd"/>
+      <w:r>
+        <w:t xml:space="preserve"> </w:t>
+      </w:r>
+      <w:proofErr w:type="spellStart"/>
+      <w:r>
+        <w:t>Droplet</w:t>
+      </w:r>
+      <w:proofErr w:type="spellEnd"/>
+      <w:r>
+        <w:t>” i aquí enganxem la clau SSH:</w:t>
       </w:r>
     </w:p>
     <w:p>
@@ -2137,7 +2746,15 @@
     <w:p>
       <w:r>
         <w:lastRenderedPageBreak/>
-        <w:t>I verifiquem que som nosaltres introduint el codi que se’ns envia al correu, un cop fet això, podrem veure com la SSH Key sortirà al llistat de la pagina:</w:t>
+        <w:t xml:space="preserve">I verifiquem que som nosaltres introduint el codi que se’ns envia al correu, un cop fet això, podrem veure com la SSH </w:t>
+      </w:r>
+      <w:proofErr w:type="spellStart"/>
+      <w:r>
+        <w:t>Key</w:t>
+      </w:r>
+      <w:proofErr w:type="spellEnd"/>
+      <w:r>
+        <w:t xml:space="preserve"> sortirà al llistat de la pagina:</w:t>
       </w:r>
     </w:p>
     <w:p>
@@ -2184,17 +2801,64 @@
       <w:pPr>
         <w:pStyle w:val="Ttulo2"/>
       </w:pPr>
-      <w:r>
-        <w:t>Comprovacio de l’acces a GitHub desde Droplet</w:t>
-      </w:r>
+      <w:proofErr w:type="spellStart"/>
+      <w:r>
+        <w:t>Comprovacio</w:t>
+      </w:r>
+      <w:proofErr w:type="spellEnd"/>
+      <w:r>
+        <w:t xml:space="preserve"> de </w:t>
+      </w:r>
+      <w:proofErr w:type="spellStart"/>
+      <w:r>
+        <w:t>l’acces</w:t>
+      </w:r>
+      <w:proofErr w:type="spellEnd"/>
+      <w:r>
+        <w:t xml:space="preserve"> a GitHub </w:t>
+      </w:r>
+      <w:proofErr w:type="spellStart"/>
+      <w:r>
+        <w:t>desde</w:t>
+      </w:r>
+      <w:proofErr w:type="spellEnd"/>
+      <w:r>
+        <w:t xml:space="preserve"> </w:t>
+      </w:r>
+      <w:proofErr w:type="spellStart"/>
+      <w:r>
+        <w:t>Droplet</w:t>
+      </w:r>
+      <w:proofErr w:type="spellEnd"/>
     </w:p>
     <w:p>
       <w:r>
-        <w:t>Per probar la connexió del Droplet amb el GitHub, farem servir la següent comanda</w:t>
-      </w:r>
-      <w:r>
-        <w:t xml:space="preserve"> dins del Droplet</w:t>
-      </w:r>
+        <w:t xml:space="preserve">Per </w:t>
+      </w:r>
+      <w:proofErr w:type="spellStart"/>
+      <w:r>
+        <w:t>probar</w:t>
+      </w:r>
+      <w:proofErr w:type="spellEnd"/>
+      <w:r>
+        <w:t xml:space="preserve"> la connexió del </w:t>
+      </w:r>
+      <w:proofErr w:type="spellStart"/>
+      <w:r>
+        <w:t>Droplet</w:t>
+      </w:r>
+      <w:proofErr w:type="spellEnd"/>
+      <w:r>
+        <w:t xml:space="preserve"> amb el GitHub, farem servir la següent comanda</w:t>
+      </w:r>
+      <w:r>
+        <w:t xml:space="preserve"> dins del </w:t>
+      </w:r>
+      <w:proofErr w:type="spellStart"/>
+      <w:r>
+        <w:t>Droplet</w:t>
+      </w:r>
+      <w:proofErr w:type="spellEnd"/>
       <w:r>
         <w:t xml:space="preserve">, </w:t>
       </w:r>
@@ -2224,7 +2888,23 @@
           <w:b/>
           <w:bCs/>
         </w:rPr>
-        <w:t xml:space="preserve">&gt; ssh -T </w:t>
+        <w:t xml:space="preserve">&gt; </w:t>
+      </w:r>
+      <w:proofErr w:type="spellStart"/>
+      <w:r>
+        <w:rPr>
+          <w:b/>
+          <w:bCs/>
+        </w:rPr>
+        <w:t>ssh</w:t>
+      </w:r>
+      <w:proofErr w:type="spellEnd"/>
+      <w:r>
+        <w:rPr>
+          <w:b/>
+          <w:bCs/>
+        </w:rPr>
+        <w:t xml:space="preserve"> -T </w:t>
       </w:r>
       <w:hyperlink r:id="rId41" w:history="1">
         <w:r>
@@ -2282,12 +2962,65 @@
         <w:pStyle w:val="Ttulo2"/>
       </w:pPr>
       <w:r>
-        <w:t>Clonació del Repo de GitHub al Droplet</w:t>
-      </w:r>
+        <w:t xml:space="preserve">Clonació del </w:t>
+      </w:r>
+      <w:proofErr w:type="spellStart"/>
+      <w:r>
+        <w:t>Repo</w:t>
+      </w:r>
+      <w:proofErr w:type="spellEnd"/>
+      <w:r>
+        <w:t xml:space="preserve"> de GitHub al </w:t>
+      </w:r>
+      <w:proofErr w:type="spellStart"/>
+      <w:r>
+        <w:t>Droplet</w:t>
+      </w:r>
+      <w:proofErr w:type="spellEnd"/>
     </w:p>
     <w:p>
       <w:r>
-        <w:t>Finalment amb aixo comprovat, ja podem clonar el repositori de GitHub a dins del Droplet, aixo ho farem dins del directori que anteriorment hem preparat per clonar el contingut del codi del repo, quedant així les comandes:</w:t>
+        <w:t xml:space="preserve">Finalment amb </w:t>
+      </w:r>
+      <w:proofErr w:type="spellStart"/>
+      <w:r>
+        <w:t>aixo</w:t>
+      </w:r>
+      <w:proofErr w:type="spellEnd"/>
+      <w:r>
+        <w:t xml:space="preserve"> comprovat, ja podem clonar el </w:t>
+      </w:r>
+      <w:proofErr w:type="spellStart"/>
+      <w:r>
+        <w:t>repositori</w:t>
+      </w:r>
+      <w:proofErr w:type="spellEnd"/>
+      <w:r>
+        <w:t xml:space="preserve"> de GitHub a dins del </w:t>
+      </w:r>
+      <w:proofErr w:type="spellStart"/>
+      <w:r>
+        <w:t>Droplet</w:t>
+      </w:r>
+      <w:proofErr w:type="spellEnd"/>
+      <w:r>
+        <w:t xml:space="preserve">, </w:t>
+      </w:r>
+      <w:proofErr w:type="spellStart"/>
+      <w:r>
+        <w:t>aixo</w:t>
+      </w:r>
+      <w:proofErr w:type="spellEnd"/>
+      <w:r>
+        <w:t xml:space="preserve"> ho farem dins del directori que anteriorment hem preparat per clonar el contingut del codi del </w:t>
+      </w:r>
+      <w:proofErr w:type="spellStart"/>
+      <w:r>
+        <w:t>repo</w:t>
+      </w:r>
+      <w:proofErr w:type="spellEnd"/>
+      <w:r>
+        <w:t>, quedant així les comandes:</w:t>
       </w:r>
     </w:p>
     <w:p>
@@ -2302,7 +3035,39 @@
           <w:b/>
           <w:bCs/>
         </w:rPr>
-        <w:t>&gt; cd /var/www/primerprojectemoreno/</w:t>
+        <w:t>&gt; cd /var/</w:t>
+      </w:r>
+      <w:proofErr w:type="spellStart"/>
+      <w:r>
+        <w:rPr>
+          <w:b/>
+          <w:bCs/>
+        </w:rPr>
+        <w:t>www</w:t>
+      </w:r>
+      <w:proofErr w:type="spellEnd"/>
+      <w:r>
+        <w:rPr>
+          <w:b/>
+          <w:bCs/>
+        </w:rPr>
+        <w:t>/</w:t>
+      </w:r>
+      <w:proofErr w:type="spellStart"/>
+      <w:r>
+        <w:rPr>
+          <w:b/>
+          <w:bCs/>
+        </w:rPr>
+        <w:t>primerprojectemoreno</w:t>
+      </w:r>
+      <w:proofErr w:type="spellEnd"/>
+      <w:r>
+        <w:rPr>
+          <w:b/>
+          <w:bCs/>
+        </w:rPr>
+        <w:t>/</w:t>
       </w:r>
     </w:p>
     <w:p>
@@ -2317,8 +3082,33 @@
           <w:b/>
           <w:bCs/>
         </w:rPr>
-        <w:t>&gt; git clone git@github.com:polmorenofp23/primerProjecteMoreno.git</w:t>
-      </w:r>
+        <w:t xml:space="preserve">&gt; git </w:t>
+      </w:r>
+      <w:proofErr w:type="spellStart"/>
+      <w:r>
+        <w:rPr>
+          <w:b/>
+          <w:bCs/>
+        </w:rPr>
+        <w:t>clone</w:t>
+      </w:r>
+      <w:proofErr w:type="spellEnd"/>
+      <w:r>
+        <w:rPr>
+          <w:b/>
+          <w:bCs/>
+        </w:rPr>
+        <w:t xml:space="preserve"> git@github.com:polmorenofp23/</w:t>
+      </w:r>
+      <w:proofErr w:type="spellStart"/>
+      <w:r>
+        <w:rPr>
+          <w:b/>
+          <w:bCs/>
+        </w:rPr>
+        <w:t>primerProjecteMoreno.git</w:t>
+      </w:r>
+      <w:proofErr w:type="spellEnd"/>
     </w:p>
     <w:p>
       <w:r>
@@ -2363,7 +3153,39 @@
     <w:p/>
     <w:p>
       <w:r>
-        <w:t>Finalment podem accedir al repositori i fer un “ls” per llistar tots els arxius i directoris que hi ha dins del repositori que hem clonat desde Git:</w:t>
+        <w:t xml:space="preserve">Finalment podem accedir al </w:t>
+      </w:r>
+      <w:proofErr w:type="spellStart"/>
+      <w:r>
+        <w:t>repositori</w:t>
+      </w:r>
+      <w:proofErr w:type="spellEnd"/>
+      <w:r>
+        <w:t xml:space="preserve"> i fer un “</w:t>
+      </w:r>
+      <w:proofErr w:type="spellStart"/>
+      <w:r>
+        <w:t>ls</w:t>
+      </w:r>
+      <w:proofErr w:type="spellEnd"/>
+      <w:r>
+        <w:t xml:space="preserve">” per llistar tots els arxius i directoris que hi ha dins del </w:t>
+      </w:r>
+      <w:proofErr w:type="spellStart"/>
+      <w:r>
+        <w:t>repositori</w:t>
+      </w:r>
+      <w:proofErr w:type="spellEnd"/>
+      <w:r>
+        <w:t xml:space="preserve"> que hem clonat </w:t>
+      </w:r>
+      <w:proofErr w:type="spellStart"/>
+      <w:r>
+        <w:t>desde</w:t>
+      </w:r>
+      <w:proofErr w:type="spellEnd"/>
+      <w:r>
+        <w:t xml:space="preserve"> Git:</w:t>
       </w:r>
     </w:p>
     <w:p>
@@ -2433,18 +3255,65 @@
           <w:rStyle w:val="Ttulo1Car"/>
         </w:rPr>
       </w:pPr>
+      <w:proofErr w:type="spellStart"/>
       <w:r>
         <w:rPr>
           <w:rStyle w:val="Ttulo1Car"/>
         </w:rPr>
         <w:lastRenderedPageBreak/>
-        <w:t>Creacio dels Dockers per fer del DROPLET un Servidor Web amb DB</w:t>
+        <w:t>Creacio</w:t>
+      </w:r>
+      <w:proofErr w:type="spellEnd"/>
+      <w:r>
+        <w:rPr>
+          <w:rStyle w:val="Ttulo1Car"/>
+        </w:rPr>
+        <w:t xml:space="preserve"> dels </w:t>
+      </w:r>
+      <w:proofErr w:type="spellStart"/>
+      <w:r>
+        <w:rPr>
+          <w:rStyle w:val="Ttulo1Car"/>
+        </w:rPr>
+        <w:t>Dockers</w:t>
+      </w:r>
+      <w:proofErr w:type="spellEnd"/>
+      <w:r>
+        <w:rPr>
+          <w:rStyle w:val="Ttulo1Car"/>
+        </w:rPr>
+        <w:t xml:space="preserve"> per fer del DROPLET un Servidor Web amb DB</w:t>
       </w:r>
     </w:p>
     <w:p>
       <w:r>
-        <w:t>Per arrencar els servei necessaris per oferir el servei Web, ho farem creant un docker Apache:PHP i un de MySQL amb un “</w:t>
-      </w:r>
+        <w:t xml:space="preserve">Per arrencar els servei necessaris per oferir el servei Web, ho farem creant un </w:t>
+      </w:r>
+      <w:proofErr w:type="spellStart"/>
+      <w:r>
+        <w:t>docker</w:t>
+      </w:r>
+      <w:proofErr w:type="spellEnd"/>
+      <w:r>
+        <w:t xml:space="preserve"> </w:t>
+      </w:r>
+      <w:proofErr w:type="spellStart"/>
+      <w:r>
+        <w:t>Apache:PHP</w:t>
+      </w:r>
+      <w:proofErr w:type="spellEnd"/>
+      <w:r>
+        <w:t xml:space="preserve"> i un de </w:t>
+      </w:r>
+      <w:proofErr w:type="spellStart"/>
+      <w:r>
+        <w:t>MySQL</w:t>
+      </w:r>
+      <w:proofErr w:type="spellEnd"/>
+      <w:r>
+        <w:t xml:space="preserve"> amb un “</w:t>
+      </w:r>
+      <w:proofErr w:type="spellStart"/>
       <w:r>
         <w:rPr>
           <w:b/>
@@ -2452,9 +3321,11 @@
         </w:rPr>
         <w:t>docker-compose.yml</w:t>
       </w:r>
+      <w:proofErr w:type="spellEnd"/>
       <w:r>
         <w:t>” i un “</w:t>
       </w:r>
+      <w:proofErr w:type="spellStart"/>
       <w:r>
         <w:rPr>
           <w:b/>
@@ -2462,6 +3333,7 @@
         </w:rPr>
         <w:t>Dockerfile</w:t>
       </w:r>
+      <w:proofErr w:type="spellEnd"/>
       <w:r>
         <w:t xml:space="preserve">”, els quals es troben continguts al directori de </w:t>
       </w:r>
@@ -2473,8 +3345,17 @@
           <w:b/>
           <w:bCs/>
         </w:rPr>
-        <w:t>/docker</w:t>
-      </w:r>
+        <w:t>/</w:t>
+      </w:r>
+      <w:proofErr w:type="spellStart"/>
+      <w:r>
+        <w:rPr>
+          <w:b/>
+          <w:bCs/>
+        </w:rPr>
+        <w:t>docker</w:t>
+      </w:r>
+      <w:proofErr w:type="spellEnd"/>
       <w:r>
         <w:t>”.</w:t>
       </w:r>
@@ -2484,7 +3365,15 @@
         <w:t>Aquests aixequen tot lo necessari per arrencar un servidor web amb la BD i executen els contingut de</w:t>
       </w:r>
       <w:r>
-        <w:t>ls scripts per omplenar la BD.</w:t>
+        <w:t xml:space="preserve">ls scripts per </w:t>
+      </w:r>
+      <w:proofErr w:type="spellStart"/>
+      <w:r>
+        <w:t>omplenar</w:t>
+      </w:r>
+      <w:proofErr w:type="spellEnd"/>
+      <w:r>
+        <w:t xml:space="preserve"> la BD.</w:t>
       </w:r>
     </w:p>
     <w:p>
@@ -2501,7 +3390,23 @@
         <w:t xml:space="preserve"> tenir tot el contingut</w:t>
       </w:r>
       <w:r>
-        <w:t xml:space="preserve">  farem un pull de lo últim que hi hagi a la branca main del repo. </w:t>
+        <w:t xml:space="preserve">  farem un pull de lo últim que hi hagi a la branca </w:t>
+      </w:r>
+      <w:proofErr w:type="spellStart"/>
+      <w:r>
+        <w:t>main</w:t>
+      </w:r>
+      <w:proofErr w:type="spellEnd"/>
+      <w:r>
+        <w:t xml:space="preserve"> del </w:t>
+      </w:r>
+      <w:proofErr w:type="spellStart"/>
+      <w:r>
+        <w:t>repo</w:t>
+      </w:r>
+      <w:proofErr w:type="spellEnd"/>
+      <w:r>
+        <w:t xml:space="preserve">. </w:t>
       </w:r>
       <w:r>
         <w:br/>
@@ -2511,8 +3416,33 @@
           <w:b/>
           <w:bCs/>
         </w:rPr>
-        <w:t>&gt; git pull origin main</w:t>
-      </w:r>
+        <w:t xml:space="preserve">&gt; git pull </w:t>
+      </w:r>
+      <w:proofErr w:type="spellStart"/>
+      <w:r>
+        <w:rPr>
+          <w:b/>
+          <w:bCs/>
+        </w:rPr>
+        <w:t>origin</w:t>
+      </w:r>
+      <w:proofErr w:type="spellEnd"/>
+      <w:r>
+        <w:rPr>
+          <w:b/>
+          <w:bCs/>
+        </w:rPr>
+        <w:t xml:space="preserve"> </w:t>
+      </w:r>
+      <w:proofErr w:type="spellStart"/>
+      <w:r>
+        <w:rPr>
+          <w:b/>
+          <w:bCs/>
+        </w:rPr>
+        <w:t>main</w:t>
+      </w:r>
+      <w:proofErr w:type="spellEnd"/>
     </w:p>
     <w:p>
       <w:r>
@@ -2556,11 +3486,27 @@
     <w:p>
       <w:r>
         <w:br/>
-        <w:t xml:space="preserve">Despres del accedirem al directory on tenim els arxius de </w:t>
+      </w:r>
+      <w:proofErr w:type="spellStart"/>
+      <w:r>
+        <w:t>Despres</w:t>
+      </w:r>
+      <w:proofErr w:type="spellEnd"/>
+      <w:r>
+        <w:t xml:space="preserve"> del accedirem al </w:t>
+      </w:r>
+      <w:proofErr w:type="spellStart"/>
+      <w:r>
+        <w:t>directory</w:t>
+      </w:r>
+      <w:proofErr w:type="spellEnd"/>
+      <w:r>
+        <w:t xml:space="preserve"> on tenim els arxius de </w:t>
       </w:r>
       <w:r>
         <w:t>“</w:t>
       </w:r>
+      <w:proofErr w:type="spellStart"/>
       <w:r>
         <w:rPr>
           <w:b/>
@@ -2568,9 +3514,11 @@
         </w:rPr>
         <w:t>Dockerfile</w:t>
       </w:r>
+      <w:proofErr w:type="spellEnd"/>
       <w:r>
         <w:t>” y “</w:t>
       </w:r>
+      <w:proofErr w:type="spellStart"/>
       <w:r>
         <w:rPr>
           <w:b/>
@@ -2585,11 +3533,20 @@
         </w:rPr>
         <w:t>ocker-compose.yml</w:t>
       </w:r>
+      <w:proofErr w:type="spellEnd"/>
       <w:r>
         <w:t xml:space="preserve">”, </w:t>
       </w:r>
       <w:r>
-        <w:t>i executarem la comanda del compose-up:</w:t>
+        <w:t xml:space="preserve">i executarem la comanda del </w:t>
+      </w:r>
+      <w:proofErr w:type="spellStart"/>
+      <w:r>
+        <w:t>compose</w:t>
+      </w:r>
+      <w:proofErr w:type="spellEnd"/>
+      <w:r>
+        <w:t>-up:</w:t>
       </w:r>
     </w:p>
     <w:p>
@@ -2656,7 +3613,71 @@
           <w:b/>
           <w:bCs/>
         </w:rPr>
-        <w:t>cd /var/www/primerprojectemoreno/primerProjecteMoreno/docker/</w:t>
+        <w:t>cd /var/</w:t>
+      </w:r>
+      <w:proofErr w:type="spellStart"/>
+      <w:r>
+        <w:rPr>
+          <w:b/>
+          <w:bCs/>
+        </w:rPr>
+        <w:t>www</w:t>
+      </w:r>
+      <w:proofErr w:type="spellEnd"/>
+      <w:r>
+        <w:rPr>
+          <w:b/>
+          <w:bCs/>
+        </w:rPr>
+        <w:t>/</w:t>
+      </w:r>
+      <w:proofErr w:type="spellStart"/>
+      <w:r>
+        <w:rPr>
+          <w:b/>
+          <w:bCs/>
+        </w:rPr>
+        <w:t>primerprojectemoreno</w:t>
+      </w:r>
+      <w:proofErr w:type="spellEnd"/>
+      <w:r>
+        <w:rPr>
+          <w:b/>
+          <w:bCs/>
+        </w:rPr>
+        <w:t>/</w:t>
+      </w:r>
+      <w:proofErr w:type="spellStart"/>
+      <w:r>
+        <w:rPr>
+          <w:b/>
+          <w:bCs/>
+        </w:rPr>
+        <w:t>primerProjecteMoreno</w:t>
+      </w:r>
+      <w:proofErr w:type="spellEnd"/>
+      <w:r>
+        <w:rPr>
+          <w:b/>
+          <w:bCs/>
+        </w:rPr>
+        <w:t>/</w:t>
+      </w:r>
+      <w:proofErr w:type="spellStart"/>
+      <w:r>
+        <w:rPr>
+          <w:b/>
+          <w:bCs/>
+        </w:rPr>
+        <w:t>docker</w:t>
+      </w:r>
+      <w:proofErr w:type="spellEnd"/>
+      <w:r>
+        <w:rPr>
+          <w:b/>
+          <w:bCs/>
+        </w:rPr>
+        <w:t>/</w:t>
       </w:r>
       <w:r>
         <w:br/>
@@ -2668,12 +3689,37 @@
         </w:rPr>
         <w:t xml:space="preserve">&gt; </w:t>
       </w:r>
-      <w:r>
-        <w:rPr>
-          <w:b/>
-          <w:bCs/>
-        </w:rPr>
-        <w:t xml:space="preserve">docker compose up -d </w:t>
+      <w:proofErr w:type="spellStart"/>
+      <w:r>
+        <w:rPr>
+          <w:b/>
+          <w:bCs/>
+        </w:rPr>
+        <w:t>docker</w:t>
+      </w:r>
+      <w:proofErr w:type="spellEnd"/>
+      <w:r>
+        <w:rPr>
+          <w:b/>
+          <w:bCs/>
+        </w:rPr>
+        <w:t xml:space="preserve"> </w:t>
+      </w:r>
+      <w:proofErr w:type="spellStart"/>
+      <w:r>
+        <w:rPr>
+          <w:b/>
+          <w:bCs/>
+        </w:rPr>
+        <w:t>compose</w:t>
+      </w:r>
+      <w:proofErr w:type="spellEnd"/>
+      <w:r>
+        <w:rPr>
+          <w:b/>
+          <w:bCs/>
+        </w:rPr>
+        <w:t xml:space="preserve"> up -d </w:t>
       </w:r>
       <w:r>
         <w:rPr>
@@ -2682,6 +3728,7 @@
         </w:rPr>
         <w:t>--</w:t>
       </w:r>
+      <w:proofErr w:type="spellStart"/>
       <w:r>
         <w:rPr>
           <w:b/>
@@ -2689,6 +3736,7 @@
         </w:rPr>
         <w:t>build</w:t>
       </w:r>
+      <w:proofErr w:type="spellEnd"/>
     </w:p>
     <w:p>
       <w:pPr>
@@ -2699,18 +3747,133 @@
       </w:pPr>
     </w:p>
     <w:p>
-      <w:r>
-        <w:t>docker stop web-app db-mysql</w:t>
-      </w:r>
+      <w:proofErr w:type="spellStart"/>
+      <w:r>
+        <w:t>docker</w:t>
+      </w:r>
+      <w:proofErr w:type="spellEnd"/>
+      <w:r>
+        <w:t xml:space="preserve"> stop web-</w:t>
+      </w:r>
+      <w:proofErr w:type="spellStart"/>
+      <w:r>
+        <w:t>app</w:t>
+      </w:r>
+      <w:proofErr w:type="spellEnd"/>
+      <w:r>
+        <w:t xml:space="preserve"> </w:t>
+      </w:r>
+      <w:proofErr w:type="spellStart"/>
+      <w:r>
+        <w:t>db-mysql</w:t>
+      </w:r>
+      <w:proofErr w:type="spellEnd"/>
     </w:p>
     <w:p>
-      <w:r>
-        <w:t>docker rm web-app db-mysql</w:t>
-      </w:r>
+      <w:proofErr w:type="spellStart"/>
+      <w:r>
+        <w:t>docker</w:t>
+      </w:r>
+      <w:proofErr w:type="spellEnd"/>
+      <w:r>
+        <w:t xml:space="preserve"> </w:t>
+      </w:r>
+      <w:proofErr w:type="spellStart"/>
+      <w:r>
+        <w:t>rm</w:t>
+      </w:r>
+      <w:proofErr w:type="spellEnd"/>
+      <w:r>
+        <w:t xml:space="preserve"> web-</w:t>
+      </w:r>
+      <w:proofErr w:type="spellStart"/>
+      <w:r>
+        <w:t>app</w:t>
+      </w:r>
+      <w:proofErr w:type="spellEnd"/>
+      <w:r>
+        <w:t xml:space="preserve"> </w:t>
+      </w:r>
+      <w:proofErr w:type="spellStart"/>
+      <w:r>
+        <w:t>db-mysql</w:t>
+      </w:r>
+      <w:proofErr w:type="spellEnd"/>
+      <w:r>
+        <w:br/>
+      </w:r>
+      <w:r>
+        <w:br/>
+      </w:r>
+      <w:r>
+        <w:t xml:space="preserve">git pull </w:t>
+      </w:r>
+      <w:proofErr w:type="spellStart"/>
+      <w:r>
+        <w:t>origin</w:t>
+      </w:r>
+      <w:proofErr w:type="spellEnd"/>
+      <w:r>
+        <w:t xml:space="preserve"> </w:t>
+      </w:r>
+      <w:proofErr w:type="spellStart"/>
+      <w:r>
+        <w:t>main</w:t>
+      </w:r>
+      <w:proofErr w:type="spellEnd"/>
     </w:p>
     <w:p>
+      <w:proofErr w:type="spellStart"/>
+      <w:r>
+        <w:t>docker</w:t>
+      </w:r>
+      <w:proofErr w:type="spellEnd"/>
+      <w:r>
+        <w:t xml:space="preserve"> </w:t>
+      </w:r>
+      <w:proofErr w:type="spellStart"/>
+      <w:r>
+        <w:t>compose</w:t>
+      </w:r>
+      <w:proofErr w:type="spellEnd"/>
+      <w:r>
+        <w:t xml:space="preserve"> </w:t>
+      </w:r>
+      <w:proofErr w:type="spellStart"/>
+      <w:r>
+        <w:t>down</w:t>
+      </w:r>
+      <w:proofErr w:type="spellEnd"/>
+      <w:r>
+        <w:t xml:space="preserve"> -v  </w:t>
+      </w:r>
+    </w:p>
+    <w:p>
+      <w:proofErr w:type="spellStart"/>
       <w:r>
         <w:lastRenderedPageBreak/>
+        <w:t>docker</w:t>
+      </w:r>
+      <w:proofErr w:type="spellEnd"/>
+      <w:r>
+        <w:t xml:space="preserve"> </w:t>
+      </w:r>
+      <w:proofErr w:type="spellStart"/>
+      <w:r>
+        <w:t>compose</w:t>
+      </w:r>
+      <w:proofErr w:type="spellEnd"/>
+      <w:r>
+        <w:t xml:space="preserve"> up -d --</w:t>
+      </w:r>
+      <w:proofErr w:type="spellStart"/>
+      <w:r>
+        <w:t>build</w:t>
+      </w:r>
+      <w:proofErr w:type="spellEnd"/>
+    </w:p>
+    <w:p>
+      <w:r>
         <w:drawing>
           <wp:inline distT="0" distB="0" distL="0" distR="0" wp14:anchorId="0A331F4C" wp14:editId="6F4FD152">
             <wp:extent cx="5400040" cy="1329690"/>
@@ -2792,7 +3955,23 @@
     </w:p>
     <w:p>
       <w:r>
-        <w:t>Fent un “docker ps -a” comprovem que s’han creat be i s’han aixecat correctament els contenidors:</w:t>
+        <w:t>Fent un “</w:t>
+      </w:r>
+      <w:proofErr w:type="spellStart"/>
+      <w:r>
+        <w:t>docker</w:t>
+      </w:r>
+      <w:proofErr w:type="spellEnd"/>
+      <w:r>
+        <w:t xml:space="preserve"> </w:t>
+      </w:r>
+      <w:proofErr w:type="spellStart"/>
+      <w:r>
+        <w:t>ps</w:t>
+      </w:r>
+      <w:proofErr w:type="spellEnd"/>
+      <w:r>
+        <w:t xml:space="preserve"> -a” comprovem que s’han creat be i s’han aixecat correctament els contenidors:</w:t>
       </w:r>
     </w:p>
     <w:p>
@@ -2835,13 +4014,133 @@
       </w:r>
     </w:p>
     <w:p>
-      <w:r>
-        <w:t>docker exec -it db-mysql bash</w:t>
-      </w:r>
+      <w:proofErr w:type="spellStart"/>
+      <w:r>
+        <w:t>docker</w:t>
+      </w:r>
+      <w:proofErr w:type="spellEnd"/>
+      <w:r>
+        <w:t xml:space="preserve"> </w:t>
+      </w:r>
+      <w:proofErr w:type="spellStart"/>
+      <w:r>
+        <w:t>exec</w:t>
+      </w:r>
+      <w:proofErr w:type="spellEnd"/>
+      <w:r>
+        <w:t xml:space="preserve"> -</w:t>
+      </w:r>
+      <w:proofErr w:type="spellStart"/>
+      <w:r>
+        <w:t>it</w:t>
+      </w:r>
+      <w:proofErr w:type="spellEnd"/>
+      <w:r>
+        <w:t xml:space="preserve"> </w:t>
+      </w:r>
+      <w:proofErr w:type="spellStart"/>
+      <w:r>
+        <w:t>db-mysql</w:t>
+      </w:r>
+      <w:proofErr w:type="spellEnd"/>
+      <w:r>
+        <w:t xml:space="preserve"> </w:t>
+      </w:r>
+      <w:proofErr w:type="spellStart"/>
+      <w:r>
+        <w:t>bash</w:t>
+      </w:r>
+      <w:proofErr w:type="spellEnd"/>
     </w:p>
     <w:p>
-      <w:r>
-        <w:t>mysql -u root -p</w:t>
+      <w:proofErr w:type="spellStart"/>
+      <w:r>
+        <w:t>mysql</w:t>
+      </w:r>
+      <w:proofErr w:type="spellEnd"/>
+      <w:r>
+        <w:t xml:space="preserve"> -u </w:t>
+      </w:r>
+      <w:proofErr w:type="spellStart"/>
+      <w:r>
+        <w:t>root</w:t>
+      </w:r>
+      <w:proofErr w:type="spellEnd"/>
+      <w:r>
+        <w:t xml:space="preserve"> -p</w:t>
+      </w:r>
+    </w:p>
+    <w:p>
+      <w:pPr>
+        <w:rPr>
+          <w:b/>
+          <w:bCs/>
+        </w:rPr>
+      </w:pPr>
+      <w:r>
+        <w:rPr>
+          <w:b/>
+          <w:bCs/>
+        </w:rPr>
+        <w:t xml:space="preserve">show </w:t>
+      </w:r>
+      <w:proofErr w:type="spellStart"/>
+      <w:r>
+        <w:rPr>
+          <w:b/>
+          <w:bCs/>
+        </w:rPr>
+        <w:t>databases</w:t>
+      </w:r>
+      <w:proofErr w:type="spellEnd"/>
+      <w:r>
+        <w:rPr>
+          <w:b/>
+          <w:bCs/>
+        </w:rPr>
+        <w:t>;</w:t>
+      </w:r>
+    </w:p>
+    <w:p>
+      <w:pPr>
+        <w:rPr>
+          <w:b/>
+          <w:bCs/>
+        </w:rPr>
+      </w:pPr>
+      <w:proofErr w:type="spellStart"/>
+      <w:r>
+        <w:rPr>
+          <w:b/>
+          <w:bCs/>
+        </w:rPr>
+        <w:t>use</w:t>
+      </w:r>
+      <w:proofErr w:type="spellEnd"/>
+      <w:r>
+        <w:rPr>
+          <w:b/>
+          <w:bCs/>
+        </w:rPr>
+        <w:t xml:space="preserve"> </w:t>
+      </w:r>
+      <w:proofErr w:type="spellStart"/>
+      <w:r>
+        <w:rPr>
+          <w:b/>
+          <w:bCs/>
+        </w:rPr>
+        <w:t>bees_cavern_db</w:t>
+      </w:r>
+      <w:proofErr w:type="spellEnd"/>
+    </w:p>
+    <w:p>
+      <w:r>
+        <w:rPr>
+          <w:b/>
+          <w:bCs/>
+        </w:rPr>
+        <w:t>show tables;</w:t>
       </w:r>
     </w:p>
     <w:p>

</xml_diff>

<commit_message>
Documentacio actualitzada a nivell de Words i Pdf (falten afegir anexos)
</commit_message>
<xml_diff>
--- a/documentation/Moreno_Pol_Upload_Web_And_DB_To_Server_DROPLET.docx
+++ b/documentation/Moreno_Pol_Upload_Web_And_DB_To_Server_DROPLET.docx
@@ -94,7 +94,6 @@
         </w:rPr>
         <w:t xml:space="preserve">  “</w:t>
       </w:r>
-      <w:proofErr w:type="spellStart"/>
       <w:r>
         <w:rPr>
           <w:rFonts w:ascii="Sting Black" w:hAnsi="Sting Black"/>
@@ -102,9 +101,8 @@
           <w:sz w:val="96"/>
           <w:szCs w:val="96"/>
         </w:rPr>
-        <w:t>Bees</w:t>
-      </w:r>
-      <w:proofErr w:type="spellEnd"/>
+        <w:t xml:space="preserve">Bees </w:t>
+      </w:r>
       <w:r>
         <w:rPr>
           <w:rFonts w:ascii="Sting Black" w:hAnsi="Sting Black"/>
@@ -112,9 +110,9 @@
           <w:sz w:val="96"/>
           <w:szCs w:val="96"/>
         </w:rPr>
-        <w:t xml:space="preserve"> </w:t>
-      </w:r>
-      <w:proofErr w:type="spellStart"/>
+        <w:t>Cavern</w:t>
+      </w:r>
+      <w:bookmarkEnd w:id="0"/>
       <w:r>
         <w:rPr>
           <w:rFonts w:ascii="Sting Black" w:hAnsi="Sting Black"/>
@@ -122,80 +120,53 @@
           <w:sz w:val="96"/>
           <w:szCs w:val="96"/>
         </w:rPr>
-        <w:t>Cavern</w:t>
-      </w:r>
-      <w:bookmarkEnd w:id="0"/>
-      <w:proofErr w:type="spellEnd"/>
-      <w:r>
+        <w:t>”</w:t>
+      </w:r>
+    </w:p>
+    <w:p>
+      <w:pPr>
+        <w:jc w:val="center"/>
+        <w:rPr>
+          <w:sz w:val="32"/>
+          <w:szCs w:val="32"/>
+        </w:rPr>
+      </w:pPr>
+    </w:p>
+    <w:p>
+      <w:pPr>
+        <w:jc w:val="center"/>
+        <w:rPr>
+          <w:sz w:val="32"/>
+          <w:szCs w:val="32"/>
+        </w:rPr>
+      </w:pPr>
+    </w:p>
+    <w:p>
+      <w:pPr>
+        <w:jc w:val="center"/>
+        <w:rPr>
+          <w:sz w:val="32"/>
+          <w:szCs w:val="32"/>
+          <w:u w:val="single"/>
+        </w:rPr>
+      </w:pPr>
+      <w:r>
+        <w:rPr>
+          <w:sz w:val="32"/>
+          <w:szCs w:val="32"/>
+        </w:rPr>
+        <w:t>Pujar la Web&amp;DB a un Servidor</w:t>
+      </w:r>
+    </w:p>
+    <w:p>
+      <w:pPr>
+        <w:jc w:val="center"/>
         <w:rPr>
           <w:rFonts w:ascii="Sting Black" w:hAnsi="Sting Black"/>
           <w:color w:val="C10000"/>
           <w:sz w:val="96"/>
           <w:szCs w:val="96"/>
         </w:rPr>
-        <w:t>”</w:t>
-      </w:r>
-    </w:p>
-    <w:p>
-      <w:pPr>
-        <w:jc w:val="center"/>
-        <w:rPr>
-          <w:sz w:val="32"/>
-          <w:szCs w:val="32"/>
-        </w:rPr>
-      </w:pPr>
-    </w:p>
-    <w:p>
-      <w:pPr>
-        <w:jc w:val="center"/>
-        <w:rPr>
-          <w:sz w:val="32"/>
-          <w:szCs w:val="32"/>
-        </w:rPr>
-      </w:pPr>
-    </w:p>
-    <w:p>
-      <w:pPr>
-        <w:jc w:val="center"/>
-        <w:rPr>
-          <w:sz w:val="32"/>
-          <w:szCs w:val="32"/>
-          <w:u w:val="single"/>
-        </w:rPr>
-      </w:pPr>
-      <w:r>
-        <w:rPr>
-          <w:sz w:val="32"/>
-          <w:szCs w:val="32"/>
-        </w:rPr>
-        <w:t xml:space="preserve">Pujar la </w:t>
-      </w:r>
-      <w:proofErr w:type="spellStart"/>
-      <w:r>
-        <w:rPr>
-          <w:sz w:val="32"/>
-          <w:szCs w:val="32"/>
-        </w:rPr>
-        <w:t>Web&amp;DB</w:t>
-      </w:r>
-      <w:proofErr w:type="spellEnd"/>
-      <w:r>
-        <w:rPr>
-          <w:sz w:val="32"/>
-          <w:szCs w:val="32"/>
-        </w:rPr>
-        <w:t xml:space="preserve"> a un Servidor</w:t>
-      </w:r>
-    </w:p>
-    <w:p>
-      <w:pPr>
-        <w:jc w:val="center"/>
-        <w:rPr>
-          <w:rFonts w:ascii="Sting Black" w:hAnsi="Sting Black"/>
-          <w:color w:val="C10000"/>
-          <w:sz w:val="96"/>
-          <w:szCs w:val="96"/>
-        </w:rPr>
       </w:pPr>
     </w:p>
     <w:p>
@@ -242,34 +213,10 @@
     </w:p>
     <w:p>
       <w:r>
-        <w:t xml:space="preserve">He escollit fer-ho amb un servidor virtual de </w:t>
-      </w:r>
-      <w:proofErr w:type="spellStart"/>
-      <w:r>
-        <w:t>DigitalOcean</w:t>
-      </w:r>
-      <w:proofErr w:type="spellEnd"/>
-      <w:r>
-        <w:t xml:space="preserve"> que s’anomenen </w:t>
-      </w:r>
-      <w:proofErr w:type="spellStart"/>
-      <w:r>
-        <w:t>Droplets</w:t>
-      </w:r>
-      <w:proofErr w:type="spellEnd"/>
-      <w:r>
-        <w:t xml:space="preserve">, aquí crearíem com una VM </w:t>
-      </w:r>
-      <w:r>
-        <w:t xml:space="preserve">en remot (anomenades </w:t>
-      </w:r>
-      <w:proofErr w:type="spellStart"/>
-      <w:r>
-        <w:t>DROPLETs</w:t>
-      </w:r>
-      <w:proofErr w:type="spellEnd"/>
-      <w:r>
-        <w:t xml:space="preserve">) </w:t>
+        <w:t xml:space="preserve">He escollit fer-ho amb un servidor virtual de DigitalOcean que s’anomenen Droplets, aquí crearíem com una VM </w:t>
+      </w:r>
+      <w:r>
+        <w:t xml:space="preserve">en remot (anomenades DROPLETs) </w:t>
       </w:r>
       <w:r>
         <w:t>on podrem aixecar els contenidors amb els serveis que siguin necessaris per servir el contingut de la web com a un servidor Web</w:t>
@@ -290,39 +237,13 @@
           <w:numId w:val="10"/>
         </w:numPr>
       </w:pPr>
-      <w:proofErr w:type="spellStart"/>
-      <w:r>
-        <w:t>Solicitar</w:t>
-      </w:r>
-      <w:proofErr w:type="spellEnd"/>
-      <w:r>
-        <w:t xml:space="preserve"> el Servei de </w:t>
-      </w:r>
-      <w:proofErr w:type="spellStart"/>
-      <w:r>
-        <w:t>DigitalOcean</w:t>
-      </w:r>
-      <w:proofErr w:type="spellEnd"/>
+      <w:r>
+        <w:t>Solicitar el Servei de DigitalOcean</w:t>
+      </w:r>
     </w:p>
     <w:p>
       <w:r>
-        <w:t xml:space="preserve">Aprofitarem el servei gratuït de GitHub per a estudiants i sol·licitarem el servei de </w:t>
-      </w:r>
-      <w:proofErr w:type="spellStart"/>
-      <w:r>
-        <w:t>DigitalOcean</w:t>
-      </w:r>
-      <w:proofErr w:type="spellEnd"/>
-      <w:r>
-        <w:t xml:space="preserve"> per fer servir l’eina de </w:t>
-      </w:r>
-      <w:proofErr w:type="spellStart"/>
-      <w:r>
-        <w:t>Droplet</w:t>
-      </w:r>
-      <w:proofErr w:type="spellEnd"/>
-      <w:r>
-        <w:t>:</w:t>
+        <w:t>Aprofitarem el servei gratuït de GitHub per a estudiants i sol·licitarem el servei de DigitalOcean per fer servir l’eina de Droplet:</w:t>
       </w:r>
     </w:p>
     <w:p>
@@ -339,29 +260,8 @@
       </w:hyperlink>
     </w:p>
     <w:p>
-      <w:proofErr w:type="spellStart"/>
-      <w:r>
-        <w:t>Clickem</w:t>
-      </w:r>
-      <w:proofErr w:type="spellEnd"/>
-      <w:r>
-        <w:t xml:space="preserve"> ma veure mes de la secció de </w:t>
-      </w:r>
-      <w:proofErr w:type="spellStart"/>
-      <w:r>
-        <w:t>WebDev</w:t>
-      </w:r>
-      <w:proofErr w:type="spellEnd"/>
-      <w:r>
-        <w:t xml:space="preserve"> i allà baixem fins trobar l’oferta de </w:t>
-      </w:r>
-      <w:proofErr w:type="spellStart"/>
-      <w:r>
-        <w:t>DigitalOcean</w:t>
-      </w:r>
-      <w:proofErr w:type="spellEnd"/>
-      <w:r>
-        <w:t xml:space="preserve">: </w:t>
+      <w:r>
+        <w:t xml:space="preserve">Clickem ma veure mes de la secció de WebDev i allà baixem fins trobar l’oferta de DigitalOcean: </w:t>
       </w:r>
     </w:p>
     <w:p>
@@ -747,23 +647,7 @@
     </w:p>
     <w:p>
       <w:r>
-        <w:t xml:space="preserve">Verifiquem la vinculació amb la </w:t>
-      </w:r>
-      <w:proofErr w:type="spellStart"/>
-      <w:r>
-        <w:t>cointa</w:t>
-      </w:r>
-      <w:proofErr w:type="spellEnd"/>
-      <w:r>
-        <w:t xml:space="preserve"> de </w:t>
-      </w:r>
-      <w:proofErr w:type="spellStart"/>
-      <w:r>
-        <w:t>github</w:t>
-      </w:r>
-      <w:proofErr w:type="spellEnd"/>
-      <w:r>
-        <w:t xml:space="preserve">: </w:t>
+        <w:t xml:space="preserve">Verifiquem la vinculació amb la cointa de github: </w:t>
       </w:r>
       <w:r>
         <w:rPr>
@@ -945,23 +829,7 @@
     </w:p>
     <w:p>
       <w:r>
-        <w:t xml:space="preserve">Un cop fet això ja disposem del crèdit per poder fer us de serveis de </w:t>
-      </w:r>
-      <w:proofErr w:type="spellStart"/>
-      <w:r>
-        <w:t>DigitalOcean</w:t>
-      </w:r>
-      <w:proofErr w:type="spellEnd"/>
-      <w:r>
-        <w:t xml:space="preserve"> per valor de 200 dollars, mes que suficient pel que </w:t>
-      </w:r>
-      <w:proofErr w:type="spellStart"/>
-      <w:r>
-        <w:t>desitjem</w:t>
-      </w:r>
-      <w:proofErr w:type="spellEnd"/>
-      <w:r>
-        <w:t xml:space="preserve"> implementar.</w:t>
+        <w:t>Un cop fet això ja disposem del crèdit per poder fer us de serveis de DigitalOcean per valor de 200 dollars, mes que suficient pel que desitjem implementar.</w:t>
       </w:r>
     </w:p>
     <w:p>
@@ -978,23 +846,7 @@
     </w:p>
     <w:p>
       <w:r>
-        <w:t>A la finestra de “</w:t>
-      </w:r>
-      <w:proofErr w:type="spellStart"/>
-      <w:r>
-        <w:t>Droplets</w:t>
-      </w:r>
-      <w:proofErr w:type="spellEnd"/>
-      <w:r>
-        <w:t xml:space="preserve">” clicarem a “Crear </w:t>
-      </w:r>
-      <w:proofErr w:type="spellStart"/>
-      <w:r>
-        <w:t>Droplet</w:t>
-      </w:r>
-      <w:proofErr w:type="spellEnd"/>
-      <w:r>
-        <w:t>”</w:t>
+        <w:t>A la finestra de “Droplets” clicarem a “Crear Droplet”</w:t>
       </w:r>
       <w:r>
         <w:t>:</w:t>
@@ -1252,23 +1104,7 @@
     </w:p>
     <w:p>
       <w:r>
-        <w:t xml:space="preserve">I com a nom del </w:t>
-      </w:r>
-      <w:proofErr w:type="spellStart"/>
-      <w:r>
-        <w:t>droplet</w:t>
-      </w:r>
-      <w:proofErr w:type="spellEnd"/>
-      <w:r>
-        <w:t xml:space="preserve"> i del host afegirem el següent “</w:t>
-      </w:r>
-      <w:proofErr w:type="spellStart"/>
-      <w:r>
-        <w:t>bc-droplet</w:t>
-      </w:r>
-      <w:proofErr w:type="spellEnd"/>
-      <w:r>
-        <w:t>”</w:t>
+        <w:t>I com a nom del droplet i del host afegirem el següent “bc-droplet”</w:t>
       </w:r>
       <w:r>
         <w:t xml:space="preserve"> afegint algun tal mes descriptiu</w:t>
@@ -1321,23 +1157,7 @@
     </w:p>
     <w:p>
       <w:r>
-        <w:t xml:space="preserve">Per </w:t>
-      </w:r>
-      <w:proofErr w:type="spellStart"/>
-      <w:r>
-        <w:t>ultim</w:t>
-      </w:r>
-      <w:proofErr w:type="spellEnd"/>
-      <w:r>
-        <w:t xml:space="preserve"> dins del projecte ja podem comprovar que el </w:t>
-      </w:r>
-      <w:proofErr w:type="spellStart"/>
-      <w:r>
-        <w:t>droplet</w:t>
-      </w:r>
-      <w:proofErr w:type="spellEnd"/>
-      <w:r>
-        <w:t xml:space="preserve"> esta creat correctament:</w:t>
+        <w:t>Per ultim dins del projecte ja podem comprovar que el droplet esta creat correctament:</w:t>
       </w:r>
     </w:p>
     <w:p>
@@ -1387,22 +1207,15 @@
       <w:pPr>
         <w:pStyle w:val="Ttulo2"/>
       </w:pPr>
-      <w:proofErr w:type="spellStart"/>
-      <w:r>
-        <w:t>Connexio</w:t>
-      </w:r>
-      <w:proofErr w:type="spellEnd"/>
-      <w:r>
-        <w:t xml:space="preserve"> al </w:t>
-      </w:r>
-      <w:proofErr w:type="spellStart"/>
+      <w:r>
+        <w:t xml:space="preserve">Connexio al </w:t>
+      </w:r>
       <w:r>
         <w:t>D</w:t>
       </w:r>
       <w:r>
         <w:t>roplet</w:t>
       </w:r>
-      <w:proofErr w:type="spellEnd"/>
     </w:p>
     <w:p>
       <w:r>
@@ -1412,15 +1225,7 @@
         <w:t>connectar-nos</w:t>
       </w:r>
       <w:r>
-        <w:t xml:space="preserve"> al </w:t>
-      </w:r>
-      <w:proofErr w:type="spellStart"/>
-      <w:r>
-        <w:t>droplet</w:t>
-      </w:r>
-      <w:proofErr w:type="spellEnd"/>
-      <w:r>
-        <w:t xml:space="preserve"> ho farem via </w:t>
+        <w:t xml:space="preserve"> al droplet ho farem via </w:t>
       </w:r>
       <w:r>
         <w:t>SSH</w:t>
@@ -1476,23 +1281,7 @@
           <w:b/>
           <w:bCs/>
         </w:rPr>
-        <w:t xml:space="preserve">&gt; </w:t>
-      </w:r>
-      <w:proofErr w:type="spellStart"/>
-      <w:r>
-        <w:rPr>
-          <w:b/>
-          <w:bCs/>
-        </w:rPr>
-        <w:t>ssh</w:t>
-      </w:r>
-      <w:proofErr w:type="spellEnd"/>
-      <w:r>
-        <w:rPr>
-          <w:b/>
-          <w:bCs/>
-        </w:rPr>
-        <w:t xml:space="preserve"> root@</w:t>
+        <w:t>&gt; ssh root@</w:t>
       </w:r>
       <w:r>
         <w:rPr>
@@ -1554,15 +1343,7 @@
     </w:p>
     <w:p>
       <w:r>
-        <w:t xml:space="preserve">Ja hem accedit al </w:t>
-      </w:r>
-      <w:proofErr w:type="spellStart"/>
-      <w:r>
-        <w:t>droplet</w:t>
-      </w:r>
-      <w:proofErr w:type="spellEnd"/>
-      <w:r>
-        <w:t xml:space="preserve"> en remot, anem a comprovar que te configurat el DNS de Google i a preparar-lo:</w:t>
+        <w:t>Ja hem accedit al droplet en remot, anem a comprovar que te configurat el DNS de Google i a preparar-lo:</w:t>
       </w:r>
     </w:p>
     <w:p>
@@ -1617,33 +1398,12 @@
         <w:t>Preparació</w:t>
       </w:r>
       <w:r>
-        <w:t xml:space="preserve"> de les eines necessàries al </w:t>
-      </w:r>
-      <w:proofErr w:type="spellStart"/>
-      <w:r>
-        <w:t>Droplet</w:t>
-      </w:r>
-      <w:proofErr w:type="spellEnd"/>
+        <w:t xml:space="preserve"> de les eines necessàries al Droplet</w:t>
+      </w:r>
     </w:p>
     <w:p>
       <w:r>
-        <w:t xml:space="preserve">Primer de res farem un </w:t>
-      </w:r>
-      <w:proofErr w:type="spellStart"/>
-      <w:r>
-        <w:t>update</w:t>
-      </w:r>
-      <w:proofErr w:type="spellEnd"/>
-      <w:r>
-        <w:t xml:space="preserve"> i </w:t>
-      </w:r>
-      <w:proofErr w:type="spellStart"/>
-      <w:r>
-        <w:t>upgrade</w:t>
-      </w:r>
-      <w:proofErr w:type="spellEnd"/>
-      <w:r>
-        <w:t xml:space="preserve"> del SO:</w:t>
+        <w:t>Primer de res farem un update i upgrade del SO:</w:t>
       </w:r>
     </w:p>
     <w:p>
@@ -1658,71 +1418,7 @@
           <w:b/>
           <w:bCs/>
         </w:rPr>
-        <w:t xml:space="preserve">&gt; </w:t>
-      </w:r>
-      <w:proofErr w:type="spellStart"/>
-      <w:r>
-        <w:rPr>
-          <w:b/>
-          <w:bCs/>
-        </w:rPr>
-        <w:t>apt</w:t>
-      </w:r>
-      <w:proofErr w:type="spellEnd"/>
-      <w:r>
-        <w:rPr>
-          <w:b/>
-          <w:bCs/>
-        </w:rPr>
-        <w:t xml:space="preserve"> </w:t>
-      </w:r>
-      <w:proofErr w:type="spellStart"/>
-      <w:r>
-        <w:rPr>
-          <w:b/>
-          <w:bCs/>
-        </w:rPr>
-        <w:t>update</w:t>
-      </w:r>
-      <w:proofErr w:type="spellEnd"/>
-      <w:r>
-        <w:rPr>
-          <w:b/>
-          <w:bCs/>
-        </w:rPr>
-        <w:t xml:space="preserve"> &amp;&amp; </w:t>
-      </w:r>
-      <w:proofErr w:type="spellStart"/>
-      <w:r>
-        <w:rPr>
-          <w:b/>
-          <w:bCs/>
-        </w:rPr>
-        <w:t>apt</w:t>
-      </w:r>
-      <w:proofErr w:type="spellEnd"/>
-      <w:r>
-        <w:rPr>
-          <w:b/>
-          <w:bCs/>
-        </w:rPr>
-        <w:t xml:space="preserve"> </w:t>
-      </w:r>
-      <w:proofErr w:type="spellStart"/>
-      <w:r>
-        <w:rPr>
-          <w:b/>
-          <w:bCs/>
-        </w:rPr>
-        <w:t>upgrade</w:t>
-      </w:r>
-      <w:proofErr w:type="spellEnd"/>
-      <w:r>
-        <w:rPr>
-          <w:b/>
-          <w:bCs/>
-        </w:rPr>
-        <w:t xml:space="preserve"> -y</w:t>
+        <w:t>&gt; apt update &amp;&amp; apt upgrade -y</w:t>
       </w:r>
     </w:p>
     <w:p>
@@ -1813,7 +1509,6 @@
       <w:r>
         <w:t>Seguit farem la descarrega  e instal·lació de les eines que necessitarem com “</w:t>
       </w:r>
-      <w:proofErr w:type="spellStart"/>
       <w:r>
         <w:rPr>
           <w:b/>
@@ -1821,7 +1516,6 @@
         </w:rPr>
         <w:t>docker</w:t>
       </w:r>
-      <w:proofErr w:type="spellEnd"/>
       <w:r>
         <w:t>” i “</w:t>
       </w:r>
@@ -1848,39 +1542,7 @@
           <w:b/>
           <w:bCs/>
         </w:rPr>
-        <w:t xml:space="preserve">&gt; </w:t>
-      </w:r>
-      <w:proofErr w:type="spellStart"/>
-      <w:r>
-        <w:rPr>
-          <w:b/>
-          <w:bCs/>
-        </w:rPr>
-        <w:t>apt</w:t>
-      </w:r>
-      <w:proofErr w:type="spellEnd"/>
-      <w:r>
-        <w:rPr>
-          <w:b/>
-          <w:bCs/>
-        </w:rPr>
-        <w:t xml:space="preserve"> </w:t>
-      </w:r>
-      <w:proofErr w:type="spellStart"/>
-      <w:r>
-        <w:rPr>
-          <w:b/>
-          <w:bCs/>
-        </w:rPr>
-        <w:t>install</w:t>
-      </w:r>
-      <w:proofErr w:type="spellEnd"/>
-      <w:r>
-        <w:rPr>
-          <w:b/>
-          <w:bCs/>
-        </w:rPr>
-        <w:t xml:space="preserve"> -y docker.io docker-compose-v2 git</w:t>
+        <w:t>&gt; apt install -y docker.io docker-compose-v2 git</w:t>
       </w:r>
     </w:p>
     <w:p>
@@ -1996,49 +1658,12 @@
         <w:t xml:space="preserve">Configuració </w:t>
       </w:r>
       <w:r>
-        <w:t xml:space="preserve">del </w:t>
-      </w:r>
-      <w:proofErr w:type="spellStart"/>
-      <w:r>
-        <w:t>Droplet</w:t>
-      </w:r>
-      <w:proofErr w:type="spellEnd"/>
+        <w:t>del Droplet</w:t>
+      </w:r>
     </w:p>
     <w:p>
       <w:r>
-        <w:t xml:space="preserve">Ara ja podríem procedir amb la creació del directori local on voldríem clonar el </w:t>
-      </w:r>
-      <w:proofErr w:type="spellStart"/>
-      <w:r>
-        <w:t>repository</w:t>
-      </w:r>
-      <w:proofErr w:type="spellEnd"/>
-      <w:r>
-        <w:t xml:space="preserve"> de GIT dins del </w:t>
-      </w:r>
-      <w:proofErr w:type="spellStart"/>
-      <w:r>
-        <w:t>Droplet</w:t>
-      </w:r>
-      <w:proofErr w:type="spellEnd"/>
-      <w:r>
-        <w:t>, així que procedirem amb això (el directori estarà en “var/</w:t>
-      </w:r>
-      <w:proofErr w:type="spellStart"/>
-      <w:r>
-        <w:t>www</w:t>
-      </w:r>
-      <w:proofErr w:type="spellEnd"/>
-      <w:r>
-        <w:t>/</w:t>
-      </w:r>
-      <w:proofErr w:type="spellStart"/>
-      <w:r>
-        <w:t>primerprojectemoreno</w:t>
-      </w:r>
-      <w:proofErr w:type="spellEnd"/>
-      <w:r>
-        <w:t>/”):</w:t>
+        <w:t>Ara ja podríem procedir amb la creació del directori local on voldríem clonar el repository de GIT dins del Droplet, així que procedirem amb això (el directori estarà en “var/www/primerprojectemoreno/”):</w:t>
       </w:r>
     </w:p>
     <w:p>
@@ -2053,49 +1678,8 @@
           <w:b/>
           <w:bCs/>
         </w:rPr>
-        <w:t xml:space="preserve">&gt; </w:t>
-      </w:r>
-      <w:proofErr w:type="spellStart"/>
-      <w:r>
-        <w:rPr>
-          <w:b/>
-          <w:bCs/>
-        </w:rPr>
-        <w:t>mkdir</w:t>
-      </w:r>
-      <w:proofErr w:type="spellEnd"/>
-      <w:r>
-        <w:rPr>
-          <w:b/>
-          <w:bCs/>
-        </w:rPr>
-        <w:t xml:space="preserve"> -p /var/</w:t>
-      </w:r>
-      <w:proofErr w:type="spellStart"/>
-      <w:r>
-        <w:rPr>
-          <w:b/>
-          <w:bCs/>
-        </w:rPr>
-        <w:t>www</w:t>
-      </w:r>
-      <w:proofErr w:type="spellEnd"/>
-      <w:r>
-        <w:rPr>
-          <w:b/>
-          <w:bCs/>
-        </w:rPr>
-        <w:t>/</w:t>
-      </w:r>
-      <w:proofErr w:type="spellStart"/>
-      <w:r>
-        <w:rPr>
-          <w:b/>
-          <w:bCs/>
-        </w:rPr>
-        <w:t>primerprojectemoreno</w:t>
-      </w:r>
-      <w:proofErr w:type="spellEnd"/>
+        <w:t>&gt; mkdir -p /var/www/primerprojectemoreno</w:t>
+      </w:r>
     </w:p>
     <w:p>
       <w:pPr>
@@ -2163,109 +1747,36 @@
           <w:b/>
           <w:bCs/>
         </w:rPr>
-        <w:t xml:space="preserve">&gt; git </w:t>
-      </w:r>
-      <w:proofErr w:type="spellStart"/>
+        <w:t xml:space="preserve">&gt; git config --global user.name “BeesCavern </w:t>
+      </w:r>
       <w:r>
         <w:rPr>
           <w:b/>
           <w:bCs/>
         </w:rPr>
-        <w:t>config</w:t>
-      </w:r>
-      <w:proofErr w:type="spellEnd"/>
+        <w:t xml:space="preserve">Pol </w:t>
+      </w:r>
       <w:r>
         <w:rPr>
           <w:b/>
           <w:bCs/>
         </w:rPr>
-        <w:t xml:space="preserve"> --global user.name “</w:t>
-      </w:r>
-      <w:proofErr w:type="spellStart"/>
-      <w:r>
+        <w:t>Droplet”</w:t>
+      </w:r>
+    </w:p>
+    <w:p>
+      <w:pPr>
         <w:rPr>
           <w:b/>
           <w:bCs/>
         </w:rPr>
-        <w:t>BeesCavern</w:t>
-      </w:r>
-      <w:proofErr w:type="spellEnd"/>
+      </w:pPr>
       <w:r>
         <w:rPr>
           <w:b/>
           <w:bCs/>
         </w:rPr>
-        <w:t xml:space="preserve"> </w:t>
-      </w:r>
-      <w:r>
-        <w:rPr>
-          <w:b/>
-          <w:bCs/>
-        </w:rPr>
-        <w:t xml:space="preserve">Pol </w:t>
-      </w:r>
-      <w:proofErr w:type="spellStart"/>
-      <w:r>
-        <w:rPr>
-          <w:b/>
-          <w:bCs/>
-        </w:rPr>
-        <w:t>Droplet</w:t>
-      </w:r>
-      <w:proofErr w:type="spellEnd"/>
-      <w:r>
-        <w:rPr>
-          <w:b/>
-          <w:bCs/>
-        </w:rPr>
-        <w:t>”</w:t>
-      </w:r>
-    </w:p>
-    <w:p>
-      <w:pPr>
-        <w:rPr>
-          <w:b/>
-          <w:bCs/>
-        </w:rPr>
-      </w:pPr>
-      <w:r>
-        <w:rPr>
-          <w:b/>
-          <w:bCs/>
-        </w:rPr>
-        <w:t xml:space="preserve">&gt; git </w:t>
-      </w:r>
-      <w:proofErr w:type="spellStart"/>
-      <w:r>
-        <w:rPr>
-          <w:b/>
-          <w:bCs/>
-        </w:rPr>
-        <w:t>config</w:t>
-      </w:r>
-      <w:proofErr w:type="spellEnd"/>
-      <w:r>
-        <w:rPr>
-          <w:b/>
-          <w:bCs/>
-        </w:rPr>
-        <w:t xml:space="preserve"> --global </w:t>
-      </w:r>
-      <w:proofErr w:type="spellStart"/>
-      <w:r>
-        <w:rPr>
-          <w:b/>
-          <w:bCs/>
-        </w:rPr>
-        <w:t>user.email</w:t>
-      </w:r>
-      <w:proofErr w:type="spellEnd"/>
-      <w:r>
-        <w:rPr>
-          <w:b/>
-          <w:bCs/>
-        </w:rPr>
-        <w:t xml:space="preserve"> “polmorenofp23@ibf.cat”</w:t>
+        <w:t>&gt; git config --global user.email “polmorenofp23@ibf.cat”</w:t>
       </w:r>
     </w:p>
     <w:p>
@@ -2309,15 +1820,7 @@
     </w:p>
     <w:p>
       <w:r>
-        <w:t xml:space="preserve">Ara ens caldrà generar dins del </w:t>
-      </w:r>
-      <w:proofErr w:type="spellStart"/>
-      <w:r>
-        <w:t>Droplet</w:t>
-      </w:r>
-      <w:proofErr w:type="spellEnd"/>
-      <w:r>
-        <w:t xml:space="preserve"> les claus de SSH amb les comandes</w:t>
+        <w:t>Ara ens caldrà generar dins del Droplet les claus de SSH amb les comandes</w:t>
       </w:r>
       <w:r>
         <w:t xml:space="preserve"> (ed25519)</w:t>
@@ -2332,23 +1835,7 @@
           <w:b/>
           <w:bCs/>
         </w:rPr>
-        <w:t xml:space="preserve">&gt; </w:t>
-      </w:r>
-      <w:proofErr w:type="spellStart"/>
-      <w:r>
-        <w:rPr>
-          <w:b/>
-          <w:bCs/>
-        </w:rPr>
-        <w:t>ssh-keygen</w:t>
-      </w:r>
-      <w:proofErr w:type="spellEnd"/>
-      <w:r>
-        <w:rPr>
-          <w:b/>
-          <w:bCs/>
-        </w:rPr>
-        <w:t xml:space="preserve"> -t </w:t>
+        <w:t xml:space="preserve">&gt; ssh-keygen -t </w:t>
       </w:r>
       <w:r>
         <w:rPr>
@@ -2425,23 +1912,7 @@
           <w:b/>
           <w:bCs/>
         </w:rPr>
-        <w:t>cat ~/.</w:t>
-      </w:r>
-      <w:proofErr w:type="spellStart"/>
-      <w:r>
-        <w:rPr>
-          <w:b/>
-          <w:bCs/>
-        </w:rPr>
-        <w:t>ssh</w:t>
-      </w:r>
-      <w:proofErr w:type="spellEnd"/>
-      <w:r>
-        <w:rPr>
-          <w:b/>
-          <w:bCs/>
-        </w:rPr>
-        <w:t>/id_</w:t>
+        <w:t>cat ~/.ssh/id_</w:t>
       </w:r>
       <w:r>
         <w:rPr>
@@ -2546,76 +2017,20 @@
           <w:b/>
           <w:bCs/>
         </w:rPr>
-        <w:t xml:space="preserve">“Settings” -&gt; “SSH </w:t>
-      </w:r>
-      <w:proofErr w:type="spellStart"/>
+        <w:t>“Settings” -&gt; “SSH and GPG Keys”</w:t>
+      </w:r>
+      <w:r>
+        <w:t xml:space="preserve"> i li donarem al boto de </w:t>
+      </w:r>
       <w:r>
         <w:rPr>
           <w:b/>
           <w:bCs/>
         </w:rPr>
-        <w:t>and</w:t>
-      </w:r>
-      <w:proofErr w:type="spellEnd"/>
-      <w:r>
-        <w:rPr>
-          <w:b/>
-          <w:bCs/>
-        </w:rPr>
-        <w:t xml:space="preserve"> GPG </w:t>
-      </w:r>
-      <w:proofErr w:type="spellStart"/>
-      <w:r>
-        <w:rPr>
-          <w:b/>
-          <w:bCs/>
-        </w:rPr>
-        <w:t>Keys</w:t>
-      </w:r>
-      <w:proofErr w:type="spellEnd"/>
-      <w:r>
-        <w:rPr>
-          <w:b/>
-          <w:bCs/>
-        </w:rPr>
-        <w:t>”</w:t>
-      </w:r>
-      <w:r>
-        <w:t xml:space="preserve"> i li donarem al boto de </w:t>
-      </w:r>
-      <w:r>
-        <w:rPr>
-          <w:b/>
-          <w:bCs/>
-        </w:rPr>
-        <w:t xml:space="preserve">“New </w:t>
-      </w:r>
-      <w:proofErr w:type="spellStart"/>
-      <w:r>
-        <w:rPr>
-          <w:b/>
-          <w:bCs/>
-        </w:rPr>
-        <w:t>SSHKey</w:t>
-      </w:r>
-      <w:proofErr w:type="spellEnd"/>
-      <w:r>
-        <w:rPr>
-          <w:b/>
-          <w:bCs/>
-        </w:rPr>
-        <w:t>”</w:t>
-      </w:r>
-      <w:r>
-        <w:t xml:space="preserve"> per donar-li autorització d’accés a la conta de git des de el </w:t>
-      </w:r>
-      <w:proofErr w:type="spellStart"/>
-      <w:r>
-        <w:t>Droplet</w:t>
-      </w:r>
-      <w:proofErr w:type="spellEnd"/>
-      <w:r>
-        <w:t>, indicant així que aquest te permís per accedir a la conta de GitHub</w:t>
+        <w:t>“New SSHKey”</w:t>
+      </w:r>
+      <w:r>
+        <w:t xml:space="preserve"> per donar-li autorització d’accés a la conta de git des de el Droplet, indicant així que aquest te permís per accedir a la conta de GitHub</w:t>
       </w:r>
       <w:r>
         <w:t xml:space="preserve"> (</w:t>
@@ -2677,31 +2092,7 @@
     <w:p/>
     <w:p>
       <w:r>
-        <w:t xml:space="preserve">Creem la clau </w:t>
-      </w:r>
-      <w:proofErr w:type="spellStart"/>
-      <w:r>
-        <w:t>afegintli</w:t>
-      </w:r>
-      <w:proofErr w:type="spellEnd"/>
-      <w:r>
-        <w:t xml:space="preserve"> un nom com el que l’identifiqui com a “</w:t>
-      </w:r>
-      <w:proofErr w:type="spellStart"/>
-      <w:r>
-        <w:t>BeesCavern</w:t>
-      </w:r>
-      <w:proofErr w:type="spellEnd"/>
-      <w:r>
-        <w:t xml:space="preserve"> </w:t>
-      </w:r>
-      <w:proofErr w:type="spellStart"/>
-      <w:r>
-        <w:t>Droplet</w:t>
-      </w:r>
-      <w:proofErr w:type="spellEnd"/>
-      <w:r>
-        <w:t>” i aquí enganxem la clau SSH:</w:t>
+        <w:t>Creem la clau afegintli un nom com el que l’identifiqui com a “BeesCavern Droplet” i aquí enganxem la clau SSH:</w:t>
       </w:r>
     </w:p>
     <w:p>
@@ -2746,15 +2137,7 @@
     <w:p>
       <w:r>
         <w:lastRenderedPageBreak/>
-        <w:t xml:space="preserve">I verifiquem que som nosaltres introduint el codi que se’ns envia al correu, un cop fet això, podrem veure com la SSH </w:t>
-      </w:r>
-      <w:proofErr w:type="spellStart"/>
-      <w:r>
-        <w:t>Key</w:t>
-      </w:r>
-      <w:proofErr w:type="spellEnd"/>
-      <w:r>
-        <w:t xml:space="preserve"> sortirà al llistat de la pagina:</w:t>
+        <w:t>I verifiquem que som nosaltres introduint el codi que se’ns envia al correu, un cop fet això, podrem veure com la SSH Key sortirà al llistat de la pagina:</w:t>
       </w:r>
     </w:p>
     <w:p>
@@ -2801,64 +2184,17 @@
       <w:pPr>
         <w:pStyle w:val="Ttulo2"/>
       </w:pPr>
-      <w:proofErr w:type="spellStart"/>
-      <w:r>
-        <w:t>Comprovacio</w:t>
-      </w:r>
-      <w:proofErr w:type="spellEnd"/>
-      <w:r>
-        <w:t xml:space="preserve"> de </w:t>
-      </w:r>
-      <w:proofErr w:type="spellStart"/>
-      <w:r>
-        <w:t>l’acces</w:t>
-      </w:r>
-      <w:proofErr w:type="spellEnd"/>
-      <w:r>
-        <w:t xml:space="preserve"> a GitHub </w:t>
-      </w:r>
-      <w:proofErr w:type="spellStart"/>
-      <w:r>
-        <w:t>desde</w:t>
-      </w:r>
-      <w:proofErr w:type="spellEnd"/>
-      <w:r>
-        <w:t xml:space="preserve"> </w:t>
-      </w:r>
-      <w:proofErr w:type="spellStart"/>
-      <w:r>
-        <w:t>Droplet</w:t>
-      </w:r>
-      <w:proofErr w:type="spellEnd"/>
+      <w:r>
+        <w:t>Comprovacio de l’acces a GitHub desde Droplet</w:t>
+      </w:r>
     </w:p>
     <w:p>
       <w:r>
-        <w:t xml:space="preserve">Per </w:t>
-      </w:r>
-      <w:proofErr w:type="spellStart"/>
-      <w:r>
-        <w:t>probar</w:t>
-      </w:r>
-      <w:proofErr w:type="spellEnd"/>
-      <w:r>
-        <w:t xml:space="preserve"> la connexió del </w:t>
-      </w:r>
-      <w:proofErr w:type="spellStart"/>
-      <w:r>
-        <w:t>Droplet</w:t>
-      </w:r>
-      <w:proofErr w:type="spellEnd"/>
-      <w:r>
-        <w:t xml:space="preserve"> amb el GitHub, farem servir la següent comanda</w:t>
-      </w:r>
-      <w:r>
-        <w:t xml:space="preserve"> dins del </w:t>
-      </w:r>
-      <w:proofErr w:type="spellStart"/>
-      <w:r>
-        <w:t>Droplet</w:t>
-      </w:r>
-      <w:proofErr w:type="spellEnd"/>
+        <w:t>Per probar la connexió del Droplet amb el GitHub, farem servir la següent comanda</w:t>
+      </w:r>
+      <w:r>
+        <w:t xml:space="preserve"> dins del Droplet</w:t>
+      </w:r>
       <w:r>
         <w:t xml:space="preserve">, </w:t>
       </w:r>
@@ -2888,23 +2224,7 @@
           <w:b/>
           <w:bCs/>
         </w:rPr>
-        <w:t xml:space="preserve">&gt; </w:t>
-      </w:r>
-      <w:proofErr w:type="spellStart"/>
-      <w:r>
-        <w:rPr>
-          <w:b/>
-          <w:bCs/>
-        </w:rPr>
-        <w:t>ssh</w:t>
-      </w:r>
-      <w:proofErr w:type="spellEnd"/>
-      <w:r>
-        <w:rPr>
-          <w:b/>
-          <w:bCs/>
-        </w:rPr>
-        <w:t xml:space="preserve"> -T </w:t>
+        <w:t xml:space="preserve">&gt; ssh -T </w:t>
       </w:r>
       <w:hyperlink r:id="rId41" w:history="1">
         <w:r>
@@ -2962,65 +2282,12 @@
         <w:pStyle w:val="Ttulo2"/>
       </w:pPr>
       <w:r>
-        <w:t xml:space="preserve">Clonació del </w:t>
-      </w:r>
-      <w:proofErr w:type="spellStart"/>
-      <w:r>
-        <w:t>Repo</w:t>
-      </w:r>
-      <w:proofErr w:type="spellEnd"/>
-      <w:r>
-        <w:t xml:space="preserve"> de GitHub al </w:t>
-      </w:r>
-      <w:proofErr w:type="spellStart"/>
-      <w:r>
-        <w:t>Droplet</w:t>
-      </w:r>
-      <w:proofErr w:type="spellEnd"/>
+        <w:t>Clonació del Repo de GitHub al Droplet</w:t>
+      </w:r>
     </w:p>
     <w:p>
       <w:r>
-        <w:t xml:space="preserve">Finalment amb </w:t>
-      </w:r>
-      <w:proofErr w:type="spellStart"/>
-      <w:r>
-        <w:t>aixo</w:t>
-      </w:r>
-      <w:proofErr w:type="spellEnd"/>
-      <w:r>
-        <w:t xml:space="preserve"> comprovat, ja podem clonar el </w:t>
-      </w:r>
-      <w:proofErr w:type="spellStart"/>
-      <w:r>
-        <w:t>repositori</w:t>
-      </w:r>
-      <w:proofErr w:type="spellEnd"/>
-      <w:r>
-        <w:t xml:space="preserve"> de GitHub a dins del </w:t>
-      </w:r>
-      <w:proofErr w:type="spellStart"/>
-      <w:r>
-        <w:t>Droplet</w:t>
-      </w:r>
-      <w:proofErr w:type="spellEnd"/>
-      <w:r>
-        <w:t xml:space="preserve">, </w:t>
-      </w:r>
-      <w:proofErr w:type="spellStart"/>
-      <w:r>
-        <w:t>aixo</w:t>
-      </w:r>
-      <w:proofErr w:type="spellEnd"/>
-      <w:r>
-        <w:t xml:space="preserve"> ho farem dins del directori que anteriorment hem preparat per clonar el contingut del codi del </w:t>
-      </w:r>
-      <w:proofErr w:type="spellStart"/>
-      <w:r>
-        <w:t>repo</w:t>
-      </w:r>
-      <w:proofErr w:type="spellEnd"/>
-      <w:r>
-        <w:t>, quedant així les comandes:</w:t>
+        <w:t>Finalment amb aixo comprovat, ja podem clonar el repositori de GitHub a dins del Droplet, aixo ho farem dins del directori que anteriorment hem preparat per clonar el contingut del codi del repo, quedant així les comandes:</w:t>
       </w:r>
     </w:p>
     <w:p>
@@ -3035,80 +2302,23 @@
           <w:b/>
           <w:bCs/>
         </w:rPr>
-        <w:t>&gt; cd /var/</w:t>
-      </w:r>
-      <w:proofErr w:type="spellStart"/>
-      <w:r>
+        <w:t>&gt; cd /var/www/primerprojectemoreno/</w:t>
+      </w:r>
+    </w:p>
+    <w:p>
+      <w:pPr>
         <w:rPr>
           <w:b/>
           <w:bCs/>
         </w:rPr>
-        <w:t>www</w:t>
-      </w:r>
-      <w:proofErr w:type="spellEnd"/>
+      </w:pPr>
       <w:r>
         <w:rPr>
           <w:b/>
           <w:bCs/>
         </w:rPr>
-        <w:t>/</w:t>
-      </w:r>
-      <w:proofErr w:type="spellStart"/>
-      <w:r>
-        <w:rPr>
-          <w:b/>
-          <w:bCs/>
-        </w:rPr>
-        <w:t>primerprojectemoreno</w:t>
-      </w:r>
-      <w:proofErr w:type="spellEnd"/>
-      <w:r>
-        <w:rPr>
-          <w:b/>
-          <w:bCs/>
-        </w:rPr>
-        <w:t>/</w:t>
-      </w:r>
-    </w:p>
-    <w:p>
-      <w:pPr>
-        <w:rPr>
-          <w:b/>
-          <w:bCs/>
-        </w:rPr>
-      </w:pPr>
-      <w:r>
-        <w:rPr>
-          <w:b/>
-          <w:bCs/>
-        </w:rPr>
-        <w:t xml:space="preserve">&gt; git </w:t>
-      </w:r>
-      <w:proofErr w:type="spellStart"/>
-      <w:r>
-        <w:rPr>
-          <w:b/>
-          <w:bCs/>
-        </w:rPr>
-        <w:t>clone</w:t>
-      </w:r>
-      <w:proofErr w:type="spellEnd"/>
-      <w:r>
-        <w:rPr>
-          <w:b/>
-          <w:bCs/>
-        </w:rPr>
-        <w:t xml:space="preserve"> git@github.com:polmorenofp23/</w:t>
-      </w:r>
-      <w:proofErr w:type="spellStart"/>
-      <w:r>
-        <w:rPr>
-          <w:b/>
-          <w:bCs/>
-        </w:rPr>
-        <w:t>primerProjecteMoreno.git</w:t>
-      </w:r>
-      <w:proofErr w:type="spellEnd"/>
+        <w:t>&gt; git clone git@github.com:polmorenofp23/primerProjecteMoreno.git</w:t>
+      </w:r>
     </w:p>
     <w:p>
       <w:r>
@@ -3153,39 +2363,7 @@
     <w:p/>
     <w:p>
       <w:r>
-        <w:t xml:space="preserve">Finalment podem accedir al </w:t>
-      </w:r>
-      <w:proofErr w:type="spellStart"/>
-      <w:r>
-        <w:t>repositori</w:t>
-      </w:r>
-      <w:proofErr w:type="spellEnd"/>
-      <w:r>
-        <w:t xml:space="preserve"> i fer un “</w:t>
-      </w:r>
-      <w:proofErr w:type="spellStart"/>
-      <w:r>
-        <w:t>ls</w:t>
-      </w:r>
-      <w:proofErr w:type="spellEnd"/>
-      <w:r>
-        <w:t xml:space="preserve">” per llistar tots els arxius i directoris que hi ha dins del </w:t>
-      </w:r>
-      <w:proofErr w:type="spellStart"/>
-      <w:r>
-        <w:t>repositori</w:t>
-      </w:r>
-      <w:proofErr w:type="spellEnd"/>
-      <w:r>
-        <w:t xml:space="preserve"> que hem clonat </w:t>
-      </w:r>
-      <w:proofErr w:type="spellStart"/>
-      <w:r>
-        <w:t>desde</w:t>
-      </w:r>
-      <w:proofErr w:type="spellEnd"/>
-      <w:r>
-        <w:t xml:space="preserve"> Git:</w:t>
+        <w:t>Finalment podem accedir al repositori i fer un “ls” per llistar tots els arxius i directoris que hi ha dins del repositori que hem clonat desde Git:</w:t>
       </w:r>
     </w:p>
     <w:p>
@@ -3255,65 +2433,18 @@
           <w:rStyle w:val="Ttulo1Car"/>
         </w:rPr>
       </w:pPr>
-      <w:proofErr w:type="spellStart"/>
       <w:r>
         <w:rPr>
           <w:rStyle w:val="Ttulo1Car"/>
         </w:rPr>
         <w:lastRenderedPageBreak/>
-        <w:t>Creacio</w:t>
-      </w:r>
-      <w:proofErr w:type="spellEnd"/>
-      <w:r>
-        <w:rPr>
-          <w:rStyle w:val="Ttulo1Car"/>
-        </w:rPr>
-        <w:t xml:space="preserve"> dels </w:t>
-      </w:r>
-      <w:proofErr w:type="spellStart"/>
-      <w:r>
-        <w:rPr>
-          <w:rStyle w:val="Ttulo1Car"/>
-        </w:rPr>
-        <w:t>Dockers</w:t>
-      </w:r>
-      <w:proofErr w:type="spellEnd"/>
-      <w:r>
-        <w:rPr>
-          <w:rStyle w:val="Ttulo1Car"/>
-        </w:rPr>
-        <w:t xml:space="preserve"> per fer del DROPLET un Servidor Web amb DB</w:t>
+        <w:t>Creacio dels Dockers per fer del DROPLET un Servidor Web amb DB</w:t>
       </w:r>
     </w:p>
     <w:p>
       <w:r>
-        <w:t xml:space="preserve">Per arrencar els servei necessaris per oferir el servei Web, ho farem creant un </w:t>
-      </w:r>
-      <w:proofErr w:type="spellStart"/>
-      <w:r>
-        <w:t>docker</w:t>
-      </w:r>
-      <w:proofErr w:type="spellEnd"/>
-      <w:r>
-        <w:t xml:space="preserve"> </w:t>
-      </w:r>
-      <w:proofErr w:type="spellStart"/>
-      <w:r>
-        <w:t>Apache:PHP</w:t>
-      </w:r>
-      <w:proofErr w:type="spellEnd"/>
-      <w:r>
-        <w:t xml:space="preserve"> i un de </w:t>
-      </w:r>
-      <w:proofErr w:type="spellStart"/>
-      <w:r>
-        <w:t>MySQL</w:t>
-      </w:r>
-      <w:proofErr w:type="spellEnd"/>
-      <w:r>
-        <w:t xml:space="preserve"> amb un “</w:t>
-      </w:r>
-      <w:proofErr w:type="spellStart"/>
+        <w:t>Per arrencar els servei necessaris per oferir el servei Web, ho farem creant un docker Apache:PHP i un de MySQL amb un “</w:t>
+      </w:r>
       <w:r>
         <w:rPr>
           <w:b/>
@@ -3321,11 +2452,9 @@
         </w:rPr>
         <w:t>docker-compose.yml</w:t>
       </w:r>
-      <w:proofErr w:type="spellEnd"/>
       <w:r>
         <w:t>” i un “</w:t>
       </w:r>
-      <w:proofErr w:type="spellStart"/>
       <w:r>
         <w:rPr>
           <w:b/>
@@ -3333,7 +2462,6 @@
         </w:rPr>
         <w:t>Dockerfile</w:t>
       </w:r>
-      <w:proofErr w:type="spellEnd"/>
       <w:r>
         <w:t xml:space="preserve">”, els quals es troben continguts al directori de </w:t>
       </w:r>
@@ -3345,104 +2473,46 @@
           <w:b/>
           <w:bCs/>
         </w:rPr>
-        <w:t>/</w:t>
-      </w:r>
-      <w:proofErr w:type="spellStart"/>
+        <w:t>/docker</w:t>
+      </w:r>
+      <w:r>
+        <w:t>”.</w:t>
+      </w:r>
+    </w:p>
+    <w:p>
+      <w:r>
+        <w:t>Aquests aixequen tot lo necessari per arrencar un servidor web amb la BD i executen els contingut de</w:t>
+      </w:r>
+      <w:r>
+        <w:t>ls scripts per omplenar la BD.</w:t>
+      </w:r>
+    </w:p>
+    <w:p>
+      <w:r>
+        <w:t xml:space="preserve">Ara per executar això, </w:t>
+      </w:r>
+      <w:r>
+        <w:t xml:space="preserve">per </w:t>
+      </w:r>
+      <w:r>
+        <w:t>assegurar-nos</w:t>
+      </w:r>
+      <w:r>
+        <w:t xml:space="preserve"> tenir tot el contingut</w:t>
+      </w:r>
+      <w:r>
+        <w:t xml:space="preserve">  farem un pull de lo últim que hi hagi a la branca main del repo. </w:t>
+      </w:r>
+      <w:r>
+        <w:br/>
+      </w:r>
       <w:r>
         <w:rPr>
           <w:b/>
           <w:bCs/>
         </w:rPr>
-        <w:t>docker</w:t>
-      </w:r>
-      <w:proofErr w:type="spellEnd"/>
-      <w:r>
-        <w:t>”.</w:t>
-      </w:r>
-    </w:p>
-    <w:p>
-      <w:r>
-        <w:t>Aquests aixequen tot lo necessari per arrencar un servidor web amb la BD i executen els contingut de</w:t>
-      </w:r>
-      <w:r>
-        <w:t xml:space="preserve">ls scripts per </w:t>
-      </w:r>
-      <w:proofErr w:type="spellStart"/>
-      <w:r>
-        <w:t>omplenar</w:t>
-      </w:r>
-      <w:proofErr w:type="spellEnd"/>
-      <w:r>
-        <w:t xml:space="preserve"> la BD.</w:t>
-      </w:r>
-    </w:p>
-    <w:p>
-      <w:r>
-        <w:t xml:space="preserve">Ara per executar això, </w:t>
-      </w:r>
-      <w:r>
-        <w:t xml:space="preserve">per </w:t>
-      </w:r>
-      <w:r>
-        <w:t>assegurar-nos</w:t>
-      </w:r>
-      <w:r>
-        <w:t xml:space="preserve"> tenir tot el contingut</w:t>
-      </w:r>
-      <w:r>
-        <w:t xml:space="preserve">  farem un pull de lo últim que hi hagi a la branca </w:t>
-      </w:r>
-      <w:proofErr w:type="spellStart"/>
-      <w:r>
-        <w:t>main</w:t>
-      </w:r>
-      <w:proofErr w:type="spellEnd"/>
-      <w:r>
-        <w:t xml:space="preserve"> del </w:t>
-      </w:r>
-      <w:proofErr w:type="spellStart"/>
-      <w:r>
-        <w:t>repo</w:t>
-      </w:r>
-      <w:proofErr w:type="spellEnd"/>
-      <w:r>
-        <w:t xml:space="preserve">. </w:t>
-      </w:r>
-      <w:r>
-        <w:br/>
-      </w:r>
-      <w:r>
-        <w:rPr>
-          <w:b/>
-          <w:bCs/>
-        </w:rPr>
-        <w:t xml:space="preserve">&gt; git pull </w:t>
-      </w:r>
-      <w:proofErr w:type="spellStart"/>
-      <w:r>
-        <w:rPr>
-          <w:b/>
-          <w:bCs/>
-        </w:rPr>
-        <w:t>origin</w:t>
-      </w:r>
-      <w:proofErr w:type="spellEnd"/>
-      <w:r>
-        <w:rPr>
-          <w:b/>
-          <w:bCs/>
-        </w:rPr>
-        <w:t xml:space="preserve"> </w:t>
-      </w:r>
-      <w:proofErr w:type="spellStart"/>
-      <w:r>
-        <w:rPr>
-          <w:b/>
-          <w:bCs/>
-        </w:rPr>
-        <w:t>main</w:t>
-      </w:r>
-      <w:proofErr w:type="spellEnd"/>
+        <w:t>&gt; git pull origin main</w:t>
+      </w:r>
     </w:p>
     <w:p>
       <w:r>
@@ -3486,27 +2556,11 @@
     <w:p>
       <w:r>
         <w:br/>
-      </w:r>
-      <w:proofErr w:type="spellStart"/>
-      <w:r>
-        <w:t>Despres</w:t>
-      </w:r>
-      <w:proofErr w:type="spellEnd"/>
-      <w:r>
-        <w:t xml:space="preserve"> del accedirem al </w:t>
-      </w:r>
-      <w:proofErr w:type="spellStart"/>
-      <w:r>
-        <w:t>directory</w:t>
-      </w:r>
-      <w:proofErr w:type="spellEnd"/>
-      <w:r>
-        <w:t xml:space="preserve"> on tenim els arxius de </w:t>
+        <w:t xml:space="preserve">Despres del accedirem al directory on tenim els arxius de </w:t>
       </w:r>
       <w:r>
         <w:t>“</w:t>
       </w:r>
-      <w:proofErr w:type="spellStart"/>
       <w:r>
         <w:rPr>
           <w:b/>
@@ -3514,11 +2568,9 @@
         </w:rPr>
         <w:t>Dockerfile</w:t>
       </w:r>
-      <w:proofErr w:type="spellEnd"/>
       <w:r>
         <w:t>” y “</w:t>
       </w:r>
-      <w:proofErr w:type="spellStart"/>
       <w:r>
         <w:rPr>
           <w:b/>
@@ -3533,20 +2585,11 @@
         </w:rPr>
         <w:t>ocker-compose.yml</w:t>
       </w:r>
-      <w:proofErr w:type="spellEnd"/>
       <w:r>
         <w:t xml:space="preserve">”, </w:t>
       </w:r>
       <w:r>
-        <w:t xml:space="preserve">i executarem la comanda del </w:t>
-      </w:r>
-      <w:proofErr w:type="spellStart"/>
-      <w:r>
-        <w:t>compose</w:t>
-      </w:r>
-      <w:proofErr w:type="spellEnd"/>
-      <w:r>
-        <w:t>-up:</w:t>
+        <w:t>i executarem la comanda del compose-up:</w:t>
       </w:r>
     </w:p>
     <w:p>
@@ -3613,75 +2656,78 @@
           <w:b/>
           <w:bCs/>
         </w:rPr>
-        <w:t>cd /var/</w:t>
-      </w:r>
-      <w:proofErr w:type="spellStart"/>
+        <w:t>cd /var/www/primerprojectemoreno/primerProjecteMoreno/docker/</w:t>
+      </w:r>
+      <w:r>
+        <w:br/>
+      </w:r>
       <w:r>
         <w:rPr>
           <w:b/>
           <w:bCs/>
         </w:rPr>
-        <w:t>www</w:t>
-      </w:r>
-      <w:proofErr w:type="spellEnd"/>
+        <w:t xml:space="preserve">&gt; </w:t>
+      </w:r>
       <w:r>
         <w:rPr>
           <w:b/>
           <w:bCs/>
         </w:rPr>
-        <w:t>/</w:t>
-      </w:r>
-      <w:proofErr w:type="spellStart"/>
+        <w:t xml:space="preserve">docker compose up -d </w:t>
+      </w:r>
       <w:r>
         <w:rPr>
           <w:b/>
           <w:bCs/>
         </w:rPr>
-        <w:t>primerprojectemoreno</w:t>
-      </w:r>
-      <w:proofErr w:type="spellEnd"/>
+        <w:t>--</w:t>
+      </w:r>
       <w:r>
         <w:rPr>
           <w:b/>
           <w:bCs/>
         </w:rPr>
-        <w:t>/</w:t>
-      </w:r>
-      <w:proofErr w:type="spellStart"/>
-      <w:r>
+        <w:t>build</w:t>
+      </w:r>
+    </w:p>
+    <w:p>
+      <w:pPr>
         <w:rPr>
           <w:b/>
           <w:bCs/>
         </w:rPr>
-        <w:t>primerProjecteMoreno</w:t>
-      </w:r>
-      <w:proofErr w:type="spellEnd"/>
+      </w:pPr>
+      <w:r>
+        <w:br/>
+      </w:r>
+      <w:r>
+        <w:t>Comandes per anar depurant els errors i pujant els nous commits als servidor:</w:t>
+      </w:r>
+      <w:r>
+        <w:br/>
+      </w:r>
       <w:r>
         <w:rPr>
           <w:b/>
           <w:bCs/>
         </w:rPr>
-        <w:t>/</w:t>
-      </w:r>
-      <w:proofErr w:type="spellStart"/>
+        <w:t xml:space="preserve">&gt; </w:t>
+      </w:r>
       <w:r>
         <w:rPr>
           <w:b/>
           <w:bCs/>
         </w:rPr>
-        <w:t>docker</w:t>
-      </w:r>
-      <w:proofErr w:type="spellEnd"/>
-      <w:r>
+        <w:t>git pull origin main</w:t>
+      </w:r>
+    </w:p>
+    <w:p>
+      <w:pPr>
         <w:rPr>
           <w:b/>
           <w:bCs/>
         </w:rPr>
-        <w:t>/</w:t>
-      </w:r>
-      <w:r>
-        <w:br/>
-      </w:r>
+      </w:pPr>
       <w:r>
         <w:rPr>
           <w:b/>
@@ -3689,191 +2735,39 @@
         </w:rPr>
         <w:t xml:space="preserve">&gt; </w:t>
       </w:r>
-      <w:proofErr w:type="spellStart"/>
       <w:r>
         <w:rPr>
           <w:b/>
           <w:bCs/>
         </w:rPr>
-        <w:t>docker</w:t>
-      </w:r>
-      <w:proofErr w:type="spellEnd"/>
-      <w:r>
+        <w:t xml:space="preserve">docker compose down -v  </w:t>
+      </w:r>
+    </w:p>
+    <w:p>
+      <w:pPr>
         <w:rPr>
           <w:b/>
           <w:bCs/>
         </w:rPr>
-        <w:t xml:space="preserve"> </w:t>
-      </w:r>
-      <w:proofErr w:type="spellStart"/>
+      </w:pPr>
       <w:r>
         <w:rPr>
           <w:b/>
           <w:bCs/>
         </w:rPr>
-        <w:t>compose</w:t>
-      </w:r>
-      <w:proofErr w:type="spellEnd"/>
+        <w:t xml:space="preserve">&gt; </w:t>
+      </w:r>
       <w:r>
         <w:rPr>
           <w:b/>
           <w:bCs/>
         </w:rPr>
-        <w:t xml:space="preserve"> up -d </w:t>
-      </w:r>
-      <w:r>
-        <w:rPr>
-          <w:b/>
-          <w:bCs/>
-        </w:rPr>
-        <w:t>--</w:t>
-      </w:r>
-      <w:proofErr w:type="spellStart"/>
-      <w:r>
-        <w:rPr>
-          <w:b/>
-          <w:bCs/>
-        </w:rPr>
-        <w:t>build</w:t>
-      </w:r>
-      <w:proofErr w:type="spellEnd"/>
+        <w:t>docker compose up -d --build</w:t>
+      </w:r>
     </w:p>
     <w:p>
-      <w:pPr>
-        <w:rPr>
-          <w:b/>
-          <w:bCs/>
-        </w:rPr>
-      </w:pPr>
-    </w:p>
-    <w:p>
-      <w:proofErr w:type="spellStart"/>
-      <w:r>
-        <w:t>docker</w:t>
-      </w:r>
-      <w:proofErr w:type="spellEnd"/>
-      <w:r>
-        <w:t xml:space="preserve"> stop web-</w:t>
-      </w:r>
-      <w:proofErr w:type="spellStart"/>
-      <w:r>
-        <w:t>app</w:t>
-      </w:r>
-      <w:proofErr w:type="spellEnd"/>
-      <w:r>
-        <w:t xml:space="preserve"> </w:t>
-      </w:r>
-      <w:proofErr w:type="spellStart"/>
-      <w:r>
-        <w:t>db-mysql</w:t>
-      </w:r>
-      <w:proofErr w:type="spellEnd"/>
-    </w:p>
-    <w:p>
-      <w:proofErr w:type="spellStart"/>
-      <w:r>
-        <w:t>docker</w:t>
-      </w:r>
-      <w:proofErr w:type="spellEnd"/>
-      <w:r>
-        <w:t xml:space="preserve"> </w:t>
-      </w:r>
-      <w:proofErr w:type="spellStart"/>
-      <w:r>
-        <w:t>rm</w:t>
-      </w:r>
-      <w:proofErr w:type="spellEnd"/>
-      <w:r>
-        <w:t xml:space="preserve"> web-</w:t>
-      </w:r>
-      <w:proofErr w:type="spellStart"/>
-      <w:r>
-        <w:t>app</w:t>
-      </w:r>
-      <w:proofErr w:type="spellEnd"/>
-      <w:r>
-        <w:t xml:space="preserve"> </w:t>
-      </w:r>
-      <w:proofErr w:type="spellStart"/>
-      <w:r>
-        <w:t>db-mysql</w:t>
-      </w:r>
-      <w:proofErr w:type="spellEnd"/>
-      <w:r>
-        <w:br/>
-      </w:r>
-      <w:r>
-        <w:br/>
-      </w:r>
-      <w:r>
-        <w:t xml:space="preserve">git pull </w:t>
-      </w:r>
-      <w:proofErr w:type="spellStart"/>
-      <w:r>
-        <w:t>origin</w:t>
-      </w:r>
-      <w:proofErr w:type="spellEnd"/>
-      <w:r>
-        <w:t xml:space="preserve"> </w:t>
-      </w:r>
-      <w:proofErr w:type="spellStart"/>
-      <w:r>
-        <w:t>main</w:t>
-      </w:r>
-      <w:proofErr w:type="spellEnd"/>
-    </w:p>
-    <w:p>
-      <w:proofErr w:type="spellStart"/>
-      <w:r>
-        <w:t>docker</w:t>
-      </w:r>
-      <w:proofErr w:type="spellEnd"/>
-      <w:r>
-        <w:t xml:space="preserve"> </w:t>
-      </w:r>
-      <w:proofErr w:type="spellStart"/>
-      <w:r>
-        <w:t>compose</w:t>
-      </w:r>
-      <w:proofErr w:type="spellEnd"/>
-      <w:r>
-        <w:t xml:space="preserve"> </w:t>
-      </w:r>
-      <w:proofErr w:type="spellStart"/>
-      <w:r>
-        <w:t>down</w:t>
-      </w:r>
-      <w:proofErr w:type="spellEnd"/>
-      <w:r>
-        <w:t xml:space="preserve"> -v  </w:t>
-      </w:r>
-    </w:p>
-    <w:p>
-      <w:proofErr w:type="spellStart"/>
       <w:r>
         <w:lastRenderedPageBreak/>
-        <w:t>docker</w:t>
-      </w:r>
-      <w:proofErr w:type="spellEnd"/>
-      <w:r>
-        <w:t xml:space="preserve"> </w:t>
-      </w:r>
-      <w:proofErr w:type="spellStart"/>
-      <w:r>
-        <w:t>compose</w:t>
-      </w:r>
-      <w:proofErr w:type="spellEnd"/>
-      <w:r>
-        <w:t xml:space="preserve"> up -d --</w:t>
-      </w:r>
-      <w:proofErr w:type="spellStart"/>
-      <w:r>
-        <w:t>build</w:t>
-      </w:r>
-      <w:proofErr w:type="spellEnd"/>
-    </w:p>
-    <w:p>
-      <w:r>
         <w:drawing>
           <wp:inline distT="0" distB="0" distL="0" distR="0" wp14:anchorId="0A331F4C" wp14:editId="6F4FD152">
             <wp:extent cx="5400040" cy="1329690"/>
@@ -3955,23 +2849,7 @@
     </w:p>
     <w:p>
       <w:r>
-        <w:t>Fent un “</w:t>
-      </w:r>
-      <w:proofErr w:type="spellStart"/>
-      <w:r>
-        <w:t>docker</w:t>
-      </w:r>
-      <w:proofErr w:type="spellEnd"/>
-      <w:r>
-        <w:t xml:space="preserve"> </w:t>
-      </w:r>
-      <w:proofErr w:type="spellStart"/>
-      <w:r>
-        <w:t>ps</w:t>
-      </w:r>
-      <w:proofErr w:type="spellEnd"/>
-      <w:r>
-        <w:t xml:space="preserve"> -a” comprovem que s’han creat be i s’han aixecat correctament els contenidors:</w:t>
+        <w:t>Fent un “docker ps -a” comprovem que s’han creat be i s’han aixecat correctament els contenidors:</w:t>
       </w:r>
     </w:p>
     <w:p>
@@ -4014,60 +2892,56 @@
       </w:r>
     </w:p>
     <w:p>
-      <w:proofErr w:type="spellStart"/>
-      <w:r>
-        <w:t>docker</w:t>
-      </w:r>
-      <w:proofErr w:type="spellEnd"/>
-      <w:r>
-        <w:t xml:space="preserve"> </w:t>
-      </w:r>
-      <w:proofErr w:type="spellStart"/>
-      <w:r>
-        <w:t>exec</w:t>
-      </w:r>
-      <w:proofErr w:type="spellEnd"/>
-      <w:r>
-        <w:t xml:space="preserve"> -</w:t>
-      </w:r>
-      <w:proofErr w:type="spellStart"/>
-      <w:r>
-        <w:t>it</w:t>
-      </w:r>
-      <w:proofErr w:type="spellEnd"/>
-      <w:r>
-        <w:t xml:space="preserve"> </w:t>
-      </w:r>
-      <w:proofErr w:type="spellStart"/>
-      <w:r>
-        <w:t>db-mysql</w:t>
-      </w:r>
-      <w:proofErr w:type="spellEnd"/>
-      <w:r>
-        <w:t xml:space="preserve"> </w:t>
-      </w:r>
-      <w:proofErr w:type="spellStart"/>
-      <w:r>
-        <w:t>bash</w:t>
-      </w:r>
-      <w:proofErr w:type="spellEnd"/>
+      <w:pPr>
+        <w:rPr>
+          <w:b/>
+          <w:bCs/>
+        </w:rPr>
+      </w:pPr>
+      <w:r>
+        <w:t>Comandes per accedir a la BD i veure el contingut creat pels scripts:</w:t>
+      </w:r>
+      <w:r>
+        <w:br/>
+      </w:r>
+      <w:r>
+        <w:br/>
+      </w:r>
+      <w:r>
+        <w:rPr>
+          <w:b/>
+          <w:bCs/>
+        </w:rPr>
+        <w:t xml:space="preserve">&gt; </w:t>
+      </w:r>
+      <w:r>
+        <w:rPr>
+          <w:b/>
+          <w:bCs/>
+        </w:rPr>
+        <w:t>docker exec -it db-mysql bash</w:t>
+      </w:r>
     </w:p>
     <w:p>
-      <w:proofErr w:type="spellStart"/>
-      <w:r>
-        <w:t>mysql</w:t>
-      </w:r>
-      <w:proofErr w:type="spellEnd"/>
-      <w:r>
-        <w:t xml:space="preserve"> -u </w:t>
-      </w:r>
-      <w:proofErr w:type="spellStart"/>
-      <w:r>
-        <w:t>root</w:t>
-      </w:r>
-      <w:proofErr w:type="spellEnd"/>
-      <w:r>
-        <w:t xml:space="preserve"> -p</w:t>
+      <w:pPr>
+        <w:rPr>
+          <w:b/>
+          <w:bCs/>
+        </w:rPr>
+      </w:pPr>
+      <w:r>
+        <w:rPr>
+          <w:b/>
+          <w:bCs/>
+        </w:rPr>
+        <w:t xml:space="preserve">&gt; </w:t>
+      </w:r>
+      <w:r>
+        <w:rPr>
+          <w:b/>
+          <w:bCs/>
+        </w:rPr>
+        <w:t>mysql -u root -p</w:t>
       </w:r>
     </w:p>
     <w:p>
@@ -4082,23 +2956,43 @@
           <w:b/>
           <w:bCs/>
         </w:rPr>
-        <w:t xml:space="preserve">show </w:t>
-      </w:r>
-      <w:proofErr w:type="spellStart"/>
+        <w:t xml:space="preserve">&gt; </w:t>
+      </w:r>
       <w:r>
         <w:rPr>
           <w:b/>
           <w:bCs/>
         </w:rPr>
-        <w:t>databases</w:t>
-      </w:r>
-      <w:proofErr w:type="spellEnd"/>
-      <w:r>
+        <w:t>show databases;</w:t>
+      </w:r>
+    </w:p>
+    <w:p>
+      <w:pPr>
         <w:rPr>
           <w:b/>
           <w:bCs/>
         </w:rPr>
-        <w:t>;</w:t>
+      </w:pPr>
+      <w:r>
+        <w:rPr>
+          <w:b/>
+          <w:bCs/>
+        </w:rPr>
+        <w:t xml:space="preserve">&gt; </w:t>
+      </w:r>
+      <w:r>
+        <w:rPr>
+          <w:b/>
+          <w:bCs/>
+        </w:rPr>
+        <w:t xml:space="preserve">use </w:t>
+      </w:r>
+      <w:r>
+        <w:rPr>
+          <w:b/>
+          <w:bCs/>
+        </w:rPr>
+        <w:t>bees_cavern_db</w:t>
       </w:r>
     </w:p>
     <w:p>
@@ -4108,84 +3002,295 @@
           <w:bCs/>
         </w:rPr>
       </w:pPr>
-      <w:proofErr w:type="spellStart"/>
       <w:r>
         <w:rPr>
           <w:b/>
           <w:bCs/>
         </w:rPr>
-        <w:t>use</w:t>
-      </w:r>
-      <w:proofErr w:type="spellEnd"/>
+        <w:t xml:space="preserve">&gt; </w:t>
+      </w:r>
       <w:r>
         <w:rPr>
           <w:b/>
           <w:bCs/>
         </w:rPr>
-        <w:t xml:space="preserve"> </w:t>
-      </w:r>
-      <w:proofErr w:type="spellStart"/>
+        <w:t>show tables;</w:t>
+      </w:r>
+    </w:p>
+    <w:p>
+      <w:r>
+        <w:t>Ara ja podríem accedir a la nostra web posant al navegador “</w:t>
+      </w:r>
       <w:r>
         <w:rPr>
           <w:b/>
           <w:bCs/>
         </w:rPr>
-        <w:t>bees_cavern_db</w:t>
-      </w:r>
-      <w:proofErr w:type="spellEnd"/>
+        <w:t xml:space="preserve">http:// </w:t>
+      </w:r>
+      <w:r>
+        <w:rPr>
+          <w:b/>
+          <w:bCs/>
+        </w:rPr>
+        <w:t>104.248.250.63</w:t>
+      </w:r>
+      <w:r>
+        <w:rPr>
+          <w:b/>
+          <w:bCs/>
+        </w:rPr>
+        <w:t>/</w:t>
+      </w:r>
+      <w:r>
+        <w:t>”</w:t>
+      </w:r>
+      <w:r>
+        <w:t>:</w:t>
+      </w:r>
     </w:p>
     <w:p>
+      <w:pPr>
+        <w:rPr>
+          <w:u w:val="single"/>
+        </w:rPr>
+      </w:pPr>
+      <w:r>
+        <w:rPr>
+          <w:u w:val="single"/>
+        </w:rPr>
+        <w:lastRenderedPageBreak/>
+        <w:drawing>
+          <wp:inline distT="0" distB="0" distL="0" distR="0" wp14:anchorId="34D58189" wp14:editId="782EEAF6">
+            <wp:extent cx="5400040" cy="2811145"/>
+            <wp:effectExtent l="0" t="0" r="0" b="8255"/>
+            <wp:docPr id="137836483" name="Imagen 1"/>
+            <wp:cNvGraphicFramePr>
+              <a:graphicFrameLocks xmlns:a="http://schemas.openxmlformats.org/drawingml/2006/main" noChangeAspect="1"/>
+            </wp:cNvGraphicFramePr>
+            <a:graphic xmlns:a="http://schemas.openxmlformats.org/drawingml/2006/main">
+              <a:graphicData uri="http://schemas.openxmlformats.org/drawingml/2006/picture">
+                <pic:pic xmlns:pic="http://schemas.openxmlformats.org/drawingml/2006/picture">
+                  <pic:nvPicPr>
+                    <pic:cNvPr id="137836483" name=""/>
+                    <pic:cNvPicPr/>
+                  </pic:nvPicPr>
+                  <pic:blipFill>
+                    <a:blip r:embed="rId50"/>
+                    <a:stretch>
+                      <a:fillRect/>
+                    </a:stretch>
+                  </pic:blipFill>
+                  <pic:spPr>
+                    <a:xfrm>
+                      <a:off x="0" y="0"/>
+                      <a:ext cx="5400040" cy="2811145"/>
+                    </a:xfrm>
+                    <a:prstGeom prst="rect">
+                      <a:avLst/>
+                    </a:prstGeom>
+                  </pic:spPr>
+                </pic:pic>
+              </a:graphicData>
+            </a:graphic>
+          </wp:inline>
+        </w:drawing>
+      </w:r>
+      <w:r>
+        <w:rPr>
+          <w:u w:val="single"/>
+        </w:rPr>
+        <w:br/>
+      </w:r>
+      <w:r>
+        <w:rPr>
+          <w:u w:val="single"/>
+        </w:rPr>
+        <w:br/>
+      </w:r>
+      <w:r>
+        <w:t>Despres si em dona temps intentaré afgir un nom de domini vinculat al  la ip del servidor. P</w:t>
+      </w:r>
+      <w:r>
+        <w:t>rocedirem a crear un domini per a la web</w:t>
+      </w:r>
+      <w:r>
+        <w:t>, dins del DigitalOcean</w:t>
+      </w:r>
+      <w:r>
+        <w:t>:</w:t>
+      </w:r>
+      <w:r>
+        <w:br/>
+      </w:r>
+    </w:p>
+    <w:p>
+      <w:r>
+        <w:t>He hagut de deixar aquestaopart perquè m’haura de posar a fer un proxi Invers per tema del certificat SSL del domini i no tinc temps ara mateix per poder invertilo en aixo, ho dedicaré a acabar la documentació.</w:t>
+      </w:r>
+    </w:p>
+    <w:p>
+      <w:r>
+        <w:t xml:space="preserve">Pero0 un company m’ha recomanat que mires de sol·licitar el domini a la pagina de </w:t>
+      </w:r>
+      <w:hyperlink r:id="rId51" w:history="1">
+        <w:r>
+          <w:rPr>
+            <w:rStyle w:val="Hipervnculo"/>
+          </w:rPr>
+          <w:t>https://www.name.com/partner/github-students</w:t>
+        </w:r>
+      </w:hyperlink>
+      <w:r>
+        <w:t>, que també es un servei per sol·licitar un domini gratuït:</w:t>
+      </w:r>
+      <w:r>
+        <w:drawing>
+          <wp:inline distT="0" distB="0" distL="0" distR="0" wp14:anchorId="1C5716DC" wp14:editId="54C8B26B">
+            <wp:extent cx="5400040" cy="2922270"/>
+            <wp:effectExtent l="0" t="0" r="0" b="0"/>
+            <wp:docPr id="1393882414" name="Imagen 1"/>
+            <wp:cNvGraphicFramePr>
+              <a:graphicFrameLocks xmlns:a="http://schemas.openxmlformats.org/drawingml/2006/main" noChangeAspect="1"/>
+            </wp:cNvGraphicFramePr>
+            <a:graphic xmlns:a="http://schemas.openxmlformats.org/drawingml/2006/main">
+              <a:graphicData uri="http://schemas.openxmlformats.org/drawingml/2006/picture">
+                <pic:pic xmlns:pic="http://schemas.openxmlformats.org/drawingml/2006/picture">
+                  <pic:nvPicPr>
+                    <pic:cNvPr id="1393882414" name=""/>
+                    <pic:cNvPicPr/>
+                  </pic:nvPicPr>
+                  <pic:blipFill>
+                    <a:blip r:embed="rId52"/>
+                    <a:stretch>
+                      <a:fillRect/>
+                    </a:stretch>
+                  </pic:blipFill>
+                  <pic:spPr>
+                    <a:xfrm>
+                      <a:off x="0" y="0"/>
+                      <a:ext cx="5400040" cy="2922270"/>
+                    </a:xfrm>
+                    <a:prstGeom prst="rect">
+                      <a:avLst/>
+                    </a:prstGeom>
+                  </pic:spPr>
+                </pic:pic>
+              </a:graphicData>
+            </a:graphic>
+          </wp:inline>
+        </w:drawing>
+      </w:r>
+    </w:p>
+    <w:p>
+      <w:r>
+        <w:lastRenderedPageBreak/>
+        <w:drawing>
+          <wp:inline distT="0" distB="0" distL="0" distR="0" wp14:anchorId="53825E5E" wp14:editId="7C00D827">
+            <wp:extent cx="5400040" cy="5382260"/>
+            <wp:effectExtent l="0" t="0" r="0" b="8890"/>
+            <wp:docPr id="1822885295" name="Imagen 1"/>
+            <wp:cNvGraphicFramePr>
+              <a:graphicFrameLocks xmlns:a="http://schemas.openxmlformats.org/drawingml/2006/main" noChangeAspect="1"/>
+            </wp:cNvGraphicFramePr>
+            <a:graphic xmlns:a="http://schemas.openxmlformats.org/drawingml/2006/main">
+              <a:graphicData uri="http://schemas.openxmlformats.org/drawingml/2006/picture">
+                <pic:pic xmlns:pic="http://schemas.openxmlformats.org/drawingml/2006/picture">
+                  <pic:nvPicPr>
+                    <pic:cNvPr id="1822885295" name=""/>
+                    <pic:cNvPicPr/>
+                  </pic:nvPicPr>
+                  <pic:blipFill>
+                    <a:blip r:embed="rId53"/>
+                    <a:stretch>
+                      <a:fillRect/>
+                    </a:stretch>
+                  </pic:blipFill>
+                  <pic:spPr>
+                    <a:xfrm>
+                      <a:off x="0" y="0"/>
+                      <a:ext cx="5400040" cy="5382260"/>
+                    </a:xfrm>
+                    <a:prstGeom prst="rect">
+                      <a:avLst/>
+                    </a:prstGeom>
+                  </pic:spPr>
+                </pic:pic>
+              </a:graphicData>
+            </a:graphic>
+          </wp:inline>
+        </w:drawing>
+      </w:r>
+    </w:p>
+    <w:p/>
+    <w:p>
+      <w:r>
+        <w:t>Aquí podríem sol·licitar aquest domini per fer us propi, i a la configuració del projecte on tenim el droplet aniríem a la secció de “</w:t>
+      </w:r>
       <w:r>
         <w:rPr>
           <w:b/>
           <w:bCs/>
         </w:rPr>
-        <w:t>show tables;</w:t>
+        <w:t>networking</w:t>
+      </w:r>
+      <w:r>
+        <w:t xml:space="preserve">” i allà </w:t>
+      </w:r>
+      <w:r>
+        <w:lastRenderedPageBreak/>
+        <w:t>afegiríem el domini al projecte.</w:t>
+      </w:r>
+      <w:r>
+        <w:br/>
+      </w:r>
+      <w:r>
+        <w:drawing>
+          <wp:inline distT="0" distB="0" distL="0" distR="0" wp14:anchorId="70C5CC54" wp14:editId="22A37D91">
+            <wp:extent cx="5400040" cy="2695575"/>
+            <wp:effectExtent l="0" t="0" r="0" b="9525"/>
+            <wp:docPr id="1260890482" name="Imagen 1"/>
+            <wp:cNvGraphicFramePr>
+              <a:graphicFrameLocks xmlns:a="http://schemas.openxmlformats.org/drawingml/2006/main" noChangeAspect="1"/>
+            </wp:cNvGraphicFramePr>
+            <a:graphic xmlns:a="http://schemas.openxmlformats.org/drawingml/2006/main">
+              <a:graphicData uri="http://schemas.openxmlformats.org/drawingml/2006/picture">
+                <pic:pic xmlns:pic="http://schemas.openxmlformats.org/drawingml/2006/picture">
+                  <pic:nvPicPr>
+                    <pic:cNvPr id="1260890482" name=""/>
+                    <pic:cNvPicPr/>
+                  </pic:nvPicPr>
+                  <pic:blipFill>
+                    <a:blip r:embed="rId54"/>
+                    <a:stretch>
+                      <a:fillRect/>
+                    </a:stretch>
+                  </pic:blipFill>
+                  <pic:spPr>
+                    <a:xfrm>
+                      <a:off x="0" y="0"/>
+                      <a:ext cx="5400040" cy="2695575"/>
+                    </a:xfrm>
+                    <a:prstGeom prst="rect">
+                      <a:avLst/>
+                    </a:prstGeom>
+                  </pic:spPr>
+                </pic:pic>
+              </a:graphicData>
+            </a:graphic>
+          </wp:inline>
+        </w:drawing>
       </w:r>
     </w:p>
     <w:p>
       <w:r>
-        <w:t>Ara ja podríem accedir a la nostra web posant al navegador “</w:t>
-      </w:r>
-      <w:r>
-        <w:rPr>
-          <w:b/>
-          <w:bCs/>
-        </w:rPr>
-        <w:t xml:space="preserve">http:// </w:t>
-      </w:r>
-      <w:r>
-        <w:rPr>
-          <w:b/>
-          <w:bCs/>
-        </w:rPr>
-        <w:t>104.248.250.63</w:t>
-      </w:r>
-      <w:r>
-        <w:rPr>
-          <w:b/>
-          <w:bCs/>
-        </w:rPr>
-        <w:t>/</w:t>
-      </w:r>
-      <w:r>
-        <w:t>”</w:t>
-      </w:r>
-      <w:r>
-        <w:t>:</w:t>
-      </w:r>
-    </w:p>
-    <w:p>
-      <w:pPr>
-        <w:rPr>
-          <w:u w:val="single"/>
-        </w:rPr>
-      </w:pPr>
+        <w:t xml:space="preserve"> </w:t>
+      </w:r>
     </w:p>
     <w:p/>
     <w:sectPr>
-      <w:headerReference w:type="default" r:id="rId50"/>
-      <w:footerReference w:type="default" r:id="rId51"/>
+      <w:headerReference w:type="default" r:id="rId55"/>
+      <w:footerReference w:type="default" r:id="rId56"/>
       <w:pgSz w:w="11906" w:h="16838"/>
       <w:pgMar w:top="1417" w:right="1701" w:bottom="1417" w:left="1701" w:header="708" w:footer="708" w:gutter="0"/>
       <w:pgNumType w:start="1"/>

</xml_diff>